<commit_message>
Finished AT2 and the prototype - fingers crossed it's all correct!
</commit_message>
<xml_diff>
--- a/Assessment 2/Ben Timewell - 2. Design and Build a Prototype Game.docx
+++ b/Assessment 2/Ben Timewell - 2. Design and Build a Prototype Game.docx
@@ -612,7 +612,23 @@
                 <w:iCs/>
                 <w:szCs w:val="20"/>
               </w:rPr>
-              <w:t xml:space="preserve"> (basically demonstrate a cleaned up version of the GUI – can be demonstrated using screenshots from within the game)</w:t>
+              <w:t xml:space="preserve"> (basically demonstrate a </w:t>
+            </w:r>
+            <w:proofErr w:type="gramStart"/>
+            <w:r>
+              <w:rPr>
+                <w:iCs/>
+                <w:szCs w:val="20"/>
+              </w:rPr>
+              <w:t>cleaned up</w:t>
+            </w:r>
+            <w:proofErr w:type="gramEnd"/>
+            <w:r>
+              <w:rPr>
+                <w:iCs/>
+                <w:szCs w:val="20"/>
+              </w:rPr>
+              <w:t xml:space="preserve"> version of the GUI – can be demonstrated using screenshots from within the game)</w:t>
             </w:r>
           </w:p>
           <w:p>
@@ -736,7 +752,23 @@
                 <w:bCs w:val="0"/>
                 <w:iCs/>
               </w:rPr>
-              <w:t>include all of the final assets listed in asset attribution.</w:t>
+              <w:t xml:space="preserve">include </w:t>
+            </w:r>
+            <w:proofErr w:type="gramStart"/>
+            <w:r>
+              <w:rPr>
+                <w:bCs w:val="0"/>
+                <w:iCs/>
+              </w:rPr>
+              <w:t>all of</w:t>
+            </w:r>
+            <w:proofErr w:type="gramEnd"/>
+            <w:r>
+              <w:rPr>
+                <w:bCs w:val="0"/>
+                <w:iCs/>
+              </w:rPr>
+              <w:t xml:space="preserve"> the final assets listed in asset attribution.</w:t>
             </w:r>
           </w:p>
         </w:tc>
@@ -1026,7 +1058,23 @@
                 <w:sz w:val="20"/>
                 <w:szCs w:val="20"/>
               </w:rPr>
-              <w:t xml:space="preserve"> G_FloatState (float)</w:t>
+              <w:t xml:space="preserve"> </w:t>
+            </w:r>
+            <w:proofErr w:type="spellStart"/>
+            <w:r>
+              <w:rPr>
+                <w:sz w:val="20"/>
+                <w:szCs w:val="20"/>
+              </w:rPr>
+              <w:t>G_FloatState</w:t>
+            </w:r>
+            <w:proofErr w:type="spellEnd"/>
+            <w:r>
+              <w:rPr>
+                <w:sz w:val="20"/>
+                <w:szCs w:val="20"/>
+              </w:rPr>
+              <w:t xml:space="preserve"> (float)</w:t>
             </w:r>
           </w:p>
           <w:p>
@@ -1067,7 +1115,23 @@
                 <w:sz w:val="20"/>
                 <w:szCs w:val="20"/>
               </w:rPr>
-              <w:t xml:space="preserve"> G_FloatState (float)</w:t>
+              <w:t xml:space="preserve"> </w:t>
+            </w:r>
+            <w:proofErr w:type="spellStart"/>
+            <w:r>
+              <w:rPr>
+                <w:sz w:val="20"/>
+                <w:szCs w:val="20"/>
+              </w:rPr>
+              <w:t>G_FloatState</w:t>
+            </w:r>
+            <w:proofErr w:type="spellEnd"/>
+            <w:r>
+              <w:rPr>
+                <w:sz w:val="20"/>
+                <w:szCs w:val="20"/>
+              </w:rPr>
+              <w:t xml:space="preserve"> (float)</w:t>
             </w:r>
           </w:p>
           <w:p>
@@ -1087,14 +1151,7 @@
                 <w:sz w:val="20"/>
                 <w:szCs w:val="20"/>
               </w:rPr>
-              <w:t>Maximum</w:t>
-            </w:r>
-            <w:r>
-              <w:rPr>
-                <w:sz w:val="20"/>
-                <w:szCs w:val="20"/>
-              </w:rPr>
-              <w:t xml:space="preserve"> Hunger level </w:t>
+              <w:t xml:space="preserve">Maximum Hunger level </w:t>
             </w:r>
             <w:r>
               <w:rPr>
@@ -1110,12 +1167,21 @@
               </w:rPr>
               <w:t xml:space="preserve"> </w:t>
             </w:r>
-            <w:r>
-              <w:rPr>
-                <w:sz w:val="20"/>
-                <w:szCs w:val="20"/>
-              </w:rPr>
-              <w:t>G_FloatState (float)</w:t>
+            <w:proofErr w:type="spellStart"/>
+            <w:r>
+              <w:rPr>
+                <w:sz w:val="20"/>
+                <w:szCs w:val="20"/>
+              </w:rPr>
+              <w:t>G_FloatState</w:t>
+            </w:r>
+            <w:proofErr w:type="spellEnd"/>
+            <w:r>
+              <w:rPr>
+                <w:sz w:val="20"/>
+                <w:szCs w:val="20"/>
+              </w:rPr>
+              <w:t xml:space="preserve"> (float)</w:t>
             </w:r>
           </w:p>
           <w:p>
@@ -1151,12 +1217,21 @@
               </w:rPr>
               <w:t xml:space="preserve"> </w:t>
             </w:r>
-            <w:r>
-              <w:rPr>
-                <w:sz w:val="20"/>
-                <w:szCs w:val="20"/>
-              </w:rPr>
-              <w:t>G_FloatState (float)</w:t>
+            <w:proofErr w:type="spellStart"/>
+            <w:r>
+              <w:rPr>
+                <w:sz w:val="20"/>
+                <w:szCs w:val="20"/>
+              </w:rPr>
+              <w:t>G_FloatState</w:t>
+            </w:r>
+            <w:proofErr w:type="spellEnd"/>
+            <w:r>
+              <w:rPr>
+                <w:sz w:val="20"/>
+                <w:szCs w:val="20"/>
+              </w:rPr>
+              <w:t xml:space="preserve"> (float)</w:t>
             </w:r>
           </w:p>
           <w:p>
@@ -1176,14 +1251,7 @@
                 <w:sz w:val="20"/>
                 <w:szCs w:val="20"/>
               </w:rPr>
-              <w:t>Workshop</w:t>
-            </w:r>
-            <w:r>
-              <w:rPr>
-                <w:sz w:val="20"/>
-                <w:szCs w:val="20"/>
-              </w:rPr>
-              <w:t xml:space="preserve"> Inventory </w:t>
+              <w:t xml:space="preserve">Workshop Inventory </w:t>
             </w:r>
             <w:r>
               <w:rPr>
@@ -1199,12 +1267,21 @@
               </w:rPr>
               <w:t xml:space="preserve"> </w:t>
             </w:r>
-            <w:r>
-              <w:rPr>
-                <w:sz w:val="20"/>
-                <w:szCs w:val="20"/>
-              </w:rPr>
-              <w:t>G_Inventory (Inventory)</w:t>
+            <w:proofErr w:type="spellStart"/>
+            <w:r>
+              <w:rPr>
+                <w:sz w:val="20"/>
+                <w:szCs w:val="20"/>
+              </w:rPr>
+              <w:t>G_Inventory</w:t>
+            </w:r>
+            <w:proofErr w:type="spellEnd"/>
+            <w:r>
+              <w:rPr>
+                <w:sz w:val="20"/>
+                <w:szCs w:val="20"/>
+              </w:rPr>
+              <w:t xml:space="preserve"> (Inventory)</w:t>
             </w:r>
           </w:p>
           <w:p>
@@ -1224,14 +1301,7 @@
                 <w:sz w:val="20"/>
                 <w:szCs w:val="20"/>
               </w:rPr>
-              <w:t>Shop</w:t>
-            </w:r>
-            <w:r>
-              <w:rPr>
-                <w:sz w:val="20"/>
-                <w:szCs w:val="20"/>
-              </w:rPr>
-              <w:t xml:space="preserve"> Inventory </w:t>
+              <w:t xml:space="preserve">Shop Inventory </w:t>
             </w:r>
             <w:r>
               <w:rPr>
@@ -1247,12 +1317,21 @@
               </w:rPr>
               <w:t xml:space="preserve"> </w:t>
             </w:r>
-            <w:r>
-              <w:rPr>
-                <w:sz w:val="20"/>
-                <w:szCs w:val="20"/>
-              </w:rPr>
-              <w:t>G_Inventory (Inventory)</w:t>
+            <w:proofErr w:type="spellStart"/>
+            <w:r>
+              <w:rPr>
+                <w:sz w:val="20"/>
+                <w:szCs w:val="20"/>
+              </w:rPr>
+              <w:t>G_Inventory</w:t>
+            </w:r>
+            <w:proofErr w:type="spellEnd"/>
+            <w:r>
+              <w:rPr>
+                <w:sz w:val="20"/>
+                <w:szCs w:val="20"/>
+              </w:rPr>
+              <w:t xml:space="preserve"> (Inventory)</w:t>
             </w:r>
           </w:p>
           <w:p>
@@ -1272,14 +1351,7 @@
                 <w:sz w:val="20"/>
                 <w:szCs w:val="20"/>
               </w:rPr>
-              <w:t>Resource</w:t>
-            </w:r>
-            <w:r>
-              <w:rPr>
-                <w:sz w:val="20"/>
-                <w:szCs w:val="20"/>
-              </w:rPr>
-              <w:t xml:space="preserve"> Inventory </w:t>
+              <w:t xml:space="preserve">Resource Inventory </w:t>
             </w:r>
             <w:r>
               <w:rPr>
@@ -1293,14 +1365,23 @@
                 <w:sz w:val="20"/>
                 <w:szCs w:val="20"/>
               </w:rPr>
-              <w:t xml:space="preserve"> G_Inventory (Inventory)</w:t>
-            </w:r>
-            <w:r>
-              <w:rPr>
-                <w:sz w:val="20"/>
-                <w:szCs w:val="20"/>
-              </w:rPr>
-              <w:t xml:space="preserve"> (tree, rocks, farmland)</w:t>
+              <w:t xml:space="preserve"> </w:t>
+            </w:r>
+            <w:proofErr w:type="spellStart"/>
+            <w:r>
+              <w:rPr>
+                <w:sz w:val="20"/>
+                <w:szCs w:val="20"/>
+              </w:rPr>
+              <w:t>G_Inventory</w:t>
+            </w:r>
+            <w:proofErr w:type="spellEnd"/>
+            <w:r>
+              <w:rPr>
+                <w:sz w:val="20"/>
+                <w:szCs w:val="20"/>
+              </w:rPr>
+              <w:t xml:space="preserve"> (Inventory) (tree, rocks, farmland)</w:t>
             </w:r>
           </w:p>
           <w:p>
@@ -1334,7 +1415,39 @@
                 <w:sz w:val="20"/>
                 <w:szCs w:val="20"/>
               </w:rPr>
-              <w:t xml:space="preserve"> G_AtLocation (LocationType)</w:t>
+              <w:t xml:space="preserve"> </w:t>
+            </w:r>
+            <w:proofErr w:type="spellStart"/>
+            <w:r>
+              <w:rPr>
+                <w:sz w:val="20"/>
+                <w:szCs w:val="20"/>
+              </w:rPr>
+              <w:t>G_AtLocation</w:t>
+            </w:r>
+            <w:proofErr w:type="spellEnd"/>
+            <w:r>
+              <w:rPr>
+                <w:sz w:val="20"/>
+                <w:szCs w:val="20"/>
+              </w:rPr>
+              <w:t xml:space="preserve"> (</w:t>
+            </w:r>
+            <w:proofErr w:type="spellStart"/>
+            <w:r>
+              <w:rPr>
+                <w:sz w:val="20"/>
+                <w:szCs w:val="20"/>
+              </w:rPr>
+              <w:t>LocationType</w:t>
+            </w:r>
+            <w:proofErr w:type="spellEnd"/>
+            <w:r>
+              <w:rPr>
+                <w:sz w:val="20"/>
+                <w:szCs w:val="20"/>
+              </w:rPr>
+              <w:t>)</w:t>
             </w:r>
           </w:p>
         </w:tc>
@@ -1373,8 +1486,10 @@
           <w:sz w:val="20"/>
           <w:szCs w:val="20"/>
         </w:rPr>
-        <w:t>What Actions will the NPC have in it’s pool?</w:t>
+        <w:t xml:space="preserve">What Actions will the NPC have in </w:t>
       </w:r>
+      <w:proofErr w:type="spellStart"/>
+      <w:proofErr w:type="gramStart"/>
       <w:r>
         <w:rPr>
           <w:b/>
@@ -1382,6 +1497,26 @@
           <w:sz w:val="20"/>
           <w:szCs w:val="20"/>
         </w:rPr>
+        <w:t>it’s</w:t>
+      </w:r>
+      <w:proofErr w:type="spellEnd"/>
+      <w:proofErr w:type="gramEnd"/>
+      <w:r>
+        <w:rPr>
+          <w:b/>
+          <w:bCs w:val="0"/>
+          <w:sz w:val="20"/>
+          <w:szCs w:val="20"/>
+        </w:rPr>
+        <w:t xml:space="preserve"> pool?</w:t>
+      </w:r>
+      <w:r>
+        <w:rPr>
+          <w:b/>
+          <w:bCs w:val="0"/>
+          <w:sz w:val="20"/>
+          <w:szCs w:val="20"/>
+        </w:rPr>
         <w:t xml:space="preserve"> (0/1)</w:t>
       </w:r>
     </w:p>
@@ -1397,7 +1532,25 @@
           <w:sz w:val="20"/>
           <w:szCs w:val="20"/>
         </w:rPr>
-        <w:t>For each action, provide a brief description of what the action will do, followed by it’s preconditions and effects (in English, not in code):</w:t>
+        <w:t xml:space="preserve">For each action, provide a brief description of what the action will do, followed by </w:t>
+      </w:r>
+      <w:proofErr w:type="spellStart"/>
+      <w:proofErr w:type="gramStart"/>
+      <w:r>
+        <w:rPr>
+          <w:sz w:val="20"/>
+          <w:szCs w:val="20"/>
+        </w:rPr>
+        <w:t>it’s</w:t>
+      </w:r>
+      <w:proofErr w:type="spellEnd"/>
+      <w:proofErr w:type="gramEnd"/>
+      <w:r>
+        <w:rPr>
+          <w:sz w:val="20"/>
+          <w:szCs w:val="20"/>
+        </w:rPr>
+        <w:t xml:space="preserve"> preconditions and effects (in English, not in code):</w:t>
       </w:r>
     </w:p>
     <w:tbl>
@@ -1603,8 +1756,17 @@
                 <w:sz w:val="20"/>
                 <w:szCs w:val="20"/>
               </w:rPr>
-              <w:t>The shop has at least 1 of the food item</w:t>
-            </w:r>
+              <w:t xml:space="preserve">The shop has at least 1 of the food </w:t>
+            </w:r>
+            <w:proofErr w:type="gramStart"/>
+            <w:r>
+              <w:rPr>
+                <w:sz w:val="20"/>
+                <w:szCs w:val="20"/>
+              </w:rPr>
+              <w:t>item</w:t>
+            </w:r>
+            <w:proofErr w:type="gramEnd"/>
           </w:p>
           <w:p>
             <w:pPr>
@@ -1834,14 +1996,7 @@
                 <w:sz w:val="20"/>
                 <w:szCs w:val="20"/>
               </w:rPr>
-              <w:t>The NPC removes 1 burger added to its inventor</w:t>
-            </w:r>
-            <w:r>
-              <w:rPr>
-                <w:sz w:val="20"/>
-                <w:szCs w:val="20"/>
-              </w:rPr>
-              <w:t>y</w:t>
+              <w:t>The NPC removes 1 burger added to its inventory</w:t>
             </w:r>
           </w:p>
           <w:p>
@@ -1950,14 +2105,7 @@
                 <w:sz w:val="20"/>
                 <w:szCs w:val="20"/>
               </w:rPr>
-              <w:t xml:space="preserve">The NPC </w:t>
-            </w:r>
-            <w:r>
-              <w:rPr>
-                <w:sz w:val="20"/>
-                <w:szCs w:val="20"/>
-              </w:rPr>
-              <w:t>is at the shop</w:t>
+              <w:t>The NPC is at the shop</w:t>
             </w:r>
           </w:p>
           <w:p>
@@ -2025,8 +2173,17 @@
                 <w:sz w:val="20"/>
                 <w:szCs w:val="20"/>
               </w:rPr>
-              <w:t xml:space="preserve"> money</w:t>
-            </w:r>
+              <w:t xml:space="preserve"> </w:t>
+            </w:r>
+            <w:proofErr w:type="gramStart"/>
+            <w:r>
+              <w:rPr>
+                <w:sz w:val="20"/>
+                <w:szCs w:val="20"/>
+              </w:rPr>
+              <w:t>money</w:t>
+            </w:r>
+            <w:proofErr w:type="gramEnd"/>
           </w:p>
           <w:p>
             <w:pPr>
@@ -2104,7 +2261,23 @@
                 <w:sz w:val="20"/>
                 <w:szCs w:val="20"/>
               </w:rPr>
-              <w:t>The shop removes 10 money from its inventory</w:t>
+              <w:t xml:space="preserve">The shop removes 10 </w:t>
+            </w:r>
+            <w:proofErr w:type="gramStart"/>
+            <w:r>
+              <w:rPr>
+                <w:sz w:val="20"/>
+                <w:szCs w:val="20"/>
+              </w:rPr>
+              <w:t>money</w:t>
+            </w:r>
+            <w:proofErr w:type="gramEnd"/>
+            <w:r>
+              <w:rPr>
+                <w:sz w:val="20"/>
+                <w:szCs w:val="20"/>
+              </w:rPr>
+              <w:t xml:space="preserve"> from its inventory</w:t>
             </w:r>
           </w:p>
           <w:p>
@@ -2124,7 +2297,23 @@
                 <w:sz w:val="20"/>
                 <w:szCs w:val="20"/>
               </w:rPr>
-              <w:t>The NPC adds 10 money to its inventory</w:t>
+              <w:t xml:space="preserve">The NPC adds 10 </w:t>
+            </w:r>
+            <w:proofErr w:type="gramStart"/>
+            <w:r>
+              <w:rPr>
+                <w:sz w:val="20"/>
+                <w:szCs w:val="20"/>
+              </w:rPr>
+              <w:t>money</w:t>
+            </w:r>
+            <w:proofErr w:type="gramEnd"/>
+            <w:r>
+              <w:rPr>
+                <w:sz w:val="20"/>
+                <w:szCs w:val="20"/>
+              </w:rPr>
+              <w:t xml:space="preserve"> to its inventory</w:t>
             </w:r>
           </w:p>
           <w:p>
@@ -2204,14 +2393,7 @@
                 <w:sz w:val="20"/>
                 <w:szCs w:val="20"/>
               </w:rPr>
-              <w:t xml:space="preserve">The NPC is at </w:t>
-            </w:r>
-            <w:r>
-              <w:rPr>
-                <w:sz w:val="20"/>
-                <w:szCs w:val="20"/>
-              </w:rPr>
-              <w:t>the resource location</w:t>
+              <w:t>The NPC is at the resource location</w:t>
             </w:r>
           </w:p>
           <w:p>
@@ -2231,14 +2413,7 @@
                 <w:sz w:val="20"/>
                 <w:szCs w:val="20"/>
               </w:rPr>
-              <w:t xml:space="preserve">The </w:t>
-            </w:r>
-            <w:r>
-              <w:rPr>
-                <w:sz w:val="20"/>
-                <w:szCs w:val="20"/>
-              </w:rPr>
-              <w:t>resource has at least 10 of the resource in its inventory</w:t>
+              <w:t>The resource has at least 10 of the resource in its inventory</w:t>
             </w:r>
           </w:p>
           <w:p>
@@ -2258,7 +2433,49 @@
                 <w:sz w:val="20"/>
                 <w:szCs w:val="20"/>
               </w:rPr>
-              <w:t>The NPC has the correct tool to get the resource (axe, pickaxe, hoe)</w:t>
+              <w:t>The NPC has the correct tool to get the resource (axe</w:t>
+            </w:r>
+            <w:r>
+              <w:rPr>
+                <w:sz w:val="20"/>
+                <w:szCs w:val="20"/>
+              </w:rPr>
+              <w:t xml:space="preserve"> for Wood</w:t>
+            </w:r>
+            <w:r>
+              <w:rPr>
+                <w:sz w:val="20"/>
+                <w:szCs w:val="20"/>
+              </w:rPr>
+              <w:t>, pickaxe</w:t>
+            </w:r>
+            <w:r>
+              <w:rPr>
+                <w:sz w:val="20"/>
+                <w:szCs w:val="20"/>
+              </w:rPr>
+              <w:t xml:space="preserve"> for Stone</w:t>
+            </w:r>
+            <w:r>
+              <w:rPr>
+                <w:sz w:val="20"/>
+                <w:szCs w:val="20"/>
+              </w:rPr>
+              <w:t xml:space="preserve">, </w:t>
+            </w:r>
+            <w:r>
+              <w:rPr>
+                <w:sz w:val="20"/>
+                <w:szCs w:val="20"/>
+              </w:rPr>
+              <w:t>shovel for Corn</w:t>
+            </w:r>
+            <w:r>
+              <w:rPr>
+                <w:sz w:val="20"/>
+                <w:szCs w:val="20"/>
+              </w:rPr>
+              <w:t>)</w:t>
             </w:r>
           </w:p>
           <w:p>
@@ -2389,14 +2606,7 @@
                 <w:sz w:val="20"/>
                 <w:szCs w:val="20"/>
               </w:rPr>
-              <w:t xml:space="preserve">The NPC is at the </w:t>
-            </w:r>
-            <w:r>
-              <w:rPr>
-                <w:sz w:val="20"/>
-                <w:szCs w:val="20"/>
-              </w:rPr>
-              <w:t>workshop</w:t>
+              <w:t>The NPC is at the workshop</w:t>
             </w:r>
           </w:p>
           <w:p>
@@ -2416,7 +2626,23 @@
                 <w:sz w:val="20"/>
                 <w:szCs w:val="20"/>
               </w:rPr>
-              <w:t>The workshop has at least 1 of the tool in its inventory</w:t>
+              <w:t xml:space="preserve">The workshop has at least 1 of the </w:t>
+            </w:r>
+            <w:proofErr w:type="gramStart"/>
+            <w:r>
+              <w:rPr>
+                <w:sz w:val="20"/>
+                <w:szCs w:val="20"/>
+              </w:rPr>
+              <w:t>tool</w:t>
+            </w:r>
+            <w:proofErr w:type="gramEnd"/>
+            <w:r>
+              <w:rPr>
+                <w:sz w:val="20"/>
+                <w:szCs w:val="20"/>
+              </w:rPr>
+              <w:t xml:space="preserve"> in its inventory</w:t>
             </w:r>
           </w:p>
           <w:p>
@@ -2453,7 +2679,23 @@
                 <w:sz w:val="20"/>
                 <w:szCs w:val="20"/>
               </w:rPr>
-              <w:t>The workshop removes 1 of the tool from its inventory</w:t>
+              <w:t xml:space="preserve">The workshop removes 1 of the </w:t>
+            </w:r>
+            <w:proofErr w:type="gramStart"/>
+            <w:r>
+              <w:rPr>
+                <w:sz w:val="20"/>
+                <w:szCs w:val="20"/>
+              </w:rPr>
+              <w:t>tool</w:t>
+            </w:r>
+            <w:proofErr w:type="gramEnd"/>
+            <w:r>
+              <w:rPr>
+                <w:sz w:val="20"/>
+                <w:szCs w:val="20"/>
+              </w:rPr>
+              <w:t xml:space="preserve"> from its inventory</w:t>
             </w:r>
           </w:p>
           <w:p>
@@ -2474,7 +2716,23 @@
                 <w:szCs w:val="20"/>
               </w:rPr>
               <w:lastRenderedPageBreak/>
-              <w:t>The NPC adds 1 of the tool to its inventory</w:t>
+              <w:t xml:space="preserve">The NPC adds 1 of the </w:t>
+            </w:r>
+            <w:proofErr w:type="gramStart"/>
+            <w:r>
+              <w:rPr>
+                <w:sz w:val="20"/>
+                <w:szCs w:val="20"/>
+              </w:rPr>
+              <w:t>tool</w:t>
+            </w:r>
+            <w:proofErr w:type="gramEnd"/>
+            <w:r>
+              <w:rPr>
+                <w:sz w:val="20"/>
+                <w:szCs w:val="20"/>
+              </w:rPr>
+              <w:t xml:space="preserve"> to its inventory</w:t>
             </w:r>
           </w:p>
         </w:tc>
@@ -2755,35 +3013,7 @@
                 <w:sz w:val="20"/>
                 <w:szCs w:val="20"/>
               </w:rPr>
-              <w:t xml:space="preserve">NPC </w:t>
-            </w:r>
-            <w:r>
-              <w:rPr>
-                <w:sz w:val="20"/>
-                <w:szCs w:val="20"/>
-              </w:rPr>
-              <w:t>energy</w:t>
-            </w:r>
-            <w:r>
-              <w:rPr>
-                <w:sz w:val="20"/>
-                <w:szCs w:val="20"/>
-              </w:rPr>
-              <w:t xml:space="preserve"> level is below </w:t>
-            </w:r>
-            <w:r>
-              <w:rPr>
-                <w:sz w:val="20"/>
-                <w:szCs w:val="20"/>
-              </w:rPr>
-              <w:t>10</w:t>
-            </w:r>
-            <w:r>
-              <w:rPr>
-                <w:sz w:val="20"/>
-                <w:szCs w:val="20"/>
-              </w:rPr>
-              <w:t>%</w:t>
+              <w:t>NPC energy level is below 10%</w:t>
             </w:r>
           </w:p>
           <w:p>
@@ -2824,21 +3054,7 @@
                 <w:sz w:val="20"/>
                 <w:szCs w:val="20"/>
               </w:rPr>
-              <w:t xml:space="preserve">NPC energy </w:t>
-            </w:r>
-            <w:r>
-              <w:rPr>
-                <w:sz w:val="20"/>
-                <w:szCs w:val="20"/>
-              </w:rPr>
-              <w:t xml:space="preserve">level </w:t>
-            </w:r>
-            <w:r>
-              <w:rPr>
-                <w:sz w:val="20"/>
-                <w:szCs w:val="20"/>
-              </w:rPr>
-              <w:t>is restored to above 80%</w:t>
+              <w:t>NPC energy level is restored to above 80%</w:t>
             </w:r>
           </w:p>
         </w:tc>
@@ -2954,21 +3170,7 @@
                 <w:sz w:val="20"/>
                 <w:szCs w:val="20"/>
               </w:rPr>
-              <w:t xml:space="preserve">Wood in Wood Stock inventory is </w:t>
-            </w:r>
-            <w:r>
-              <w:rPr>
-                <w:sz w:val="20"/>
-                <w:szCs w:val="20"/>
-              </w:rPr>
-              <w:t>at or above</w:t>
-            </w:r>
-            <w:r>
-              <w:rPr>
-                <w:sz w:val="20"/>
-                <w:szCs w:val="20"/>
-              </w:rPr>
-              <w:t xml:space="preserve"> X amount</w:t>
+              <w:t>Wood in Wood Stock inventory is at or above X amount</w:t>
             </w:r>
           </w:p>
           <w:p>
@@ -3049,28 +3251,7 @@
                 <w:sz w:val="20"/>
                 <w:szCs w:val="20"/>
               </w:rPr>
-              <w:t>Stone</w:t>
-            </w:r>
-            <w:r>
-              <w:rPr>
-                <w:sz w:val="20"/>
-                <w:szCs w:val="20"/>
-              </w:rPr>
-              <w:t xml:space="preserve"> in </w:t>
-            </w:r>
-            <w:r>
-              <w:rPr>
-                <w:sz w:val="20"/>
-                <w:szCs w:val="20"/>
-              </w:rPr>
-              <w:t>Smelter</w:t>
-            </w:r>
-            <w:r>
-              <w:rPr>
-                <w:sz w:val="20"/>
-                <w:szCs w:val="20"/>
-              </w:rPr>
-              <w:t xml:space="preserve"> inventory is below X amount</w:t>
+              <w:t>Stone in Smelter inventory is below X amount</w:t>
             </w:r>
           </w:p>
           <w:p>
@@ -3191,16 +3372,7 @@
                 <w:szCs w:val="20"/>
               </w:rPr>
               <w:lastRenderedPageBreak/>
-              <w:t xml:space="preserve">Gather X amount of </w:t>
-            </w:r>
-            <w:r>
-              <w:rPr>
-                <w:b/>
-                <w:bCs w:val="0"/>
-                <w:sz w:val="20"/>
-                <w:szCs w:val="20"/>
-              </w:rPr>
-              <w:t>Corn</w:t>
+              <w:t>Gather X amount of Corn</w:t>
             </w:r>
           </w:p>
           <w:p>
@@ -3239,28 +3411,7 @@
                 <w:sz w:val="20"/>
                 <w:szCs w:val="20"/>
               </w:rPr>
-              <w:t>Corn</w:t>
-            </w:r>
-            <w:r>
-              <w:rPr>
-                <w:sz w:val="20"/>
-                <w:szCs w:val="20"/>
-              </w:rPr>
-              <w:t xml:space="preserve"> in </w:t>
-            </w:r>
-            <w:r>
-              <w:rPr>
-                <w:sz w:val="20"/>
-                <w:szCs w:val="20"/>
-              </w:rPr>
-              <w:t>Mill</w:t>
-            </w:r>
-            <w:r>
-              <w:rPr>
-                <w:sz w:val="20"/>
-                <w:szCs w:val="20"/>
-              </w:rPr>
-              <w:t xml:space="preserve"> inventory is below X amount</w:t>
+              <w:t>Corn in Mill inventory is below X amount</w:t>
             </w:r>
           </w:p>
           <w:p>
@@ -3415,53 +3566,133 @@
                 <w:sz w:val="20"/>
                 <w:szCs w:val="20"/>
               </w:rPr>
-              <w:t>Based on the defined states, actions and goals, the NPC will behave as a self managing worker that maintains its survival needs (food), as well as the stock pile of various resource (wood, stone and corn) automatically.</w:t>
-            </w:r>
-          </w:p>
-          <w:p>
-            <w:pPr>
-              <w:rPr>
-                <w:sz w:val="20"/>
-                <w:szCs w:val="20"/>
-              </w:rPr>
-            </w:pPr>
-          </w:p>
-          <w:p>
-            <w:pPr>
-              <w:rPr>
-                <w:sz w:val="20"/>
-                <w:szCs w:val="20"/>
-              </w:rPr>
-            </w:pPr>
-            <w:r>
-              <w:rPr>
-                <w:sz w:val="20"/>
-                <w:szCs w:val="20"/>
-              </w:rPr>
-              <w:t>When the NPC hunger levels drop below a threshold, it will prioritise staying alive by travelling to the shop and purchasing food, it’ll then consume the food to increase its hunger levels. Once they are restored to above a safe limit, it’ll resume its resource gathering work. It will do a similar action to restore energy, but it’ll travel to a designated rest area for a period of time before returning to resource gathering.</w:t>
-            </w:r>
-          </w:p>
-          <w:p>
-            <w:pPr>
-              <w:rPr>
-                <w:sz w:val="20"/>
-                <w:szCs w:val="20"/>
-              </w:rPr>
-            </w:pPr>
-          </w:p>
-          <w:p>
-            <w:pPr>
-              <w:rPr>
-                <w:sz w:val="20"/>
-                <w:szCs w:val="20"/>
-              </w:rPr>
-            </w:pPr>
-            <w:r>
-              <w:rPr>
-                <w:sz w:val="20"/>
-                <w:szCs w:val="20"/>
-              </w:rPr>
-              <w:t>The NPC will also monitor the resource stock piles and will prioritise gathering the lowest resource first, defaulting to corn -&gt; wood -&gt; stone if they are all equal. To gather resources, the NPC will travel to the workshop first to gather the correct tools before heading to the resource location. Once there, it’ll run an action to obtain the resource, then return to the resource stock pile to drop off the resource and obtain money for collecting it.</w:t>
+              <w:t xml:space="preserve">Based on the defined states, actions and goals, the NPC will behave as a </w:t>
+            </w:r>
+            <w:proofErr w:type="spellStart"/>
+            <w:r>
+              <w:rPr>
+                <w:sz w:val="20"/>
+                <w:szCs w:val="20"/>
+              </w:rPr>
+              <w:t>self managing</w:t>
+            </w:r>
+            <w:proofErr w:type="spellEnd"/>
+            <w:r>
+              <w:rPr>
+                <w:sz w:val="20"/>
+                <w:szCs w:val="20"/>
+              </w:rPr>
+              <w:t xml:space="preserve"> worker that maintains its survival needs (food), as well as the </w:t>
+            </w:r>
+            <w:proofErr w:type="gramStart"/>
+            <w:r>
+              <w:rPr>
+                <w:sz w:val="20"/>
+                <w:szCs w:val="20"/>
+              </w:rPr>
+              <w:t>stock pile</w:t>
+            </w:r>
+            <w:proofErr w:type="gramEnd"/>
+            <w:r>
+              <w:rPr>
+                <w:sz w:val="20"/>
+                <w:szCs w:val="20"/>
+              </w:rPr>
+              <w:t xml:space="preserve"> of various resource (wood, stone and corn) automatically.</w:t>
+            </w:r>
+          </w:p>
+          <w:p>
+            <w:pPr>
+              <w:rPr>
+                <w:sz w:val="20"/>
+                <w:szCs w:val="20"/>
+              </w:rPr>
+            </w:pPr>
+          </w:p>
+          <w:p>
+            <w:pPr>
+              <w:rPr>
+                <w:sz w:val="20"/>
+                <w:szCs w:val="20"/>
+              </w:rPr>
+            </w:pPr>
+            <w:r>
+              <w:rPr>
+                <w:sz w:val="20"/>
+                <w:szCs w:val="20"/>
+              </w:rPr>
+              <w:t xml:space="preserve">When the NPC hunger levels drop below a threshold, it will prioritise staying alive by travelling to the shop and purchasing food, it’ll then consume the food to increase its hunger levels. Once they are restored to above a safe limit, it’ll resume its resource gathering work. It will do a similar action to restore energy, but it’ll travel to a designated rest area for </w:t>
+            </w:r>
+            <w:proofErr w:type="gramStart"/>
+            <w:r>
+              <w:rPr>
+                <w:sz w:val="20"/>
+                <w:szCs w:val="20"/>
+              </w:rPr>
+              <w:t>a period of time</w:t>
+            </w:r>
+            <w:proofErr w:type="gramEnd"/>
+            <w:r>
+              <w:rPr>
+                <w:sz w:val="20"/>
+                <w:szCs w:val="20"/>
+              </w:rPr>
+              <w:t xml:space="preserve"> before returning to resource gathering.</w:t>
+            </w:r>
+          </w:p>
+          <w:p>
+            <w:pPr>
+              <w:rPr>
+                <w:sz w:val="20"/>
+                <w:szCs w:val="20"/>
+              </w:rPr>
+            </w:pPr>
+          </w:p>
+          <w:p>
+            <w:pPr>
+              <w:rPr>
+                <w:sz w:val="20"/>
+                <w:szCs w:val="20"/>
+              </w:rPr>
+            </w:pPr>
+            <w:r>
+              <w:rPr>
+                <w:sz w:val="20"/>
+                <w:szCs w:val="20"/>
+              </w:rPr>
+              <w:t xml:space="preserve">The NPC will also monitor the resource </w:t>
+            </w:r>
+            <w:proofErr w:type="gramStart"/>
+            <w:r>
+              <w:rPr>
+                <w:sz w:val="20"/>
+                <w:szCs w:val="20"/>
+              </w:rPr>
+              <w:t>stock piles</w:t>
+            </w:r>
+            <w:proofErr w:type="gramEnd"/>
+            <w:r>
+              <w:rPr>
+                <w:sz w:val="20"/>
+                <w:szCs w:val="20"/>
+              </w:rPr>
+              <w:t xml:space="preserve"> and will prioritise gathering the lowest resource first, defaulting to corn -&gt; wood -&gt; stone if they are all equal. To gather resources, the NPC will travel to the workshop first to gather the correct tools before heading to the resource location. Once there, it’ll run an action to obtain the resource, then return to the resource </w:t>
+            </w:r>
+            <w:proofErr w:type="gramStart"/>
+            <w:r>
+              <w:rPr>
+                <w:sz w:val="20"/>
+                <w:szCs w:val="20"/>
+              </w:rPr>
+              <w:t>stock pile</w:t>
+            </w:r>
+            <w:proofErr w:type="gramEnd"/>
+            <w:r>
+              <w:rPr>
+                <w:sz w:val="20"/>
+                <w:szCs w:val="20"/>
+              </w:rPr>
+              <w:t xml:space="preserve"> to drop off the resource and obtain money for collecting it.</w:t>
             </w:r>
           </w:p>
           <w:p>
@@ -3780,7 +4011,25 @@
                 <w:sz w:val="20"/>
                 <w:szCs w:val="20"/>
               </w:rPr>
-              <w:t>Hunger (G_FloatState – float)</w:t>
+              <w:t>Hunger (</w:t>
+            </w:r>
+            <w:proofErr w:type="spellStart"/>
+            <w:r>
+              <w:rPr>
+                <w:b/>
+                <w:sz w:val="20"/>
+                <w:szCs w:val="20"/>
+              </w:rPr>
+              <w:t>G_FloatState</w:t>
+            </w:r>
+            <w:proofErr w:type="spellEnd"/>
+            <w:r>
+              <w:rPr>
+                <w:b/>
+                <w:sz w:val="20"/>
+                <w:szCs w:val="20"/>
+              </w:rPr>
+              <w:t xml:space="preserve"> – float)</w:t>
             </w:r>
           </w:p>
           <w:p>
@@ -3824,7 +4073,25 @@
                 <w:sz w:val="20"/>
                 <w:szCs w:val="20"/>
               </w:rPr>
-              <w:t>Used as a primary input for survival based Utility decisions (such as eating food)</w:t>
+              <w:t xml:space="preserve">Used as a primary input for </w:t>
+            </w:r>
+            <w:proofErr w:type="gramStart"/>
+            <w:r>
+              <w:rPr>
+                <w:bCs w:val="0"/>
+                <w:sz w:val="20"/>
+                <w:szCs w:val="20"/>
+              </w:rPr>
+              <w:t>survival based</w:t>
+            </w:r>
+            <w:proofErr w:type="gramEnd"/>
+            <w:r>
+              <w:rPr>
+                <w:bCs w:val="0"/>
+                <w:sz w:val="20"/>
+                <w:szCs w:val="20"/>
+              </w:rPr>
+              <w:t xml:space="preserve"> Utility decisions (such as eating food)</w:t>
             </w:r>
           </w:p>
           <w:p>
@@ -3931,7 +4198,25 @@
                 <w:sz w:val="20"/>
                 <w:szCs w:val="20"/>
               </w:rPr>
-              <w:t>Energy (G_FloatState – float)</w:t>
+              <w:t>Energy (</w:t>
+            </w:r>
+            <w:proofErr w:type="spellStart"/>
+            <w:r>
+              <w:rPr>
+                <w:b/>
+                <w:sz w:val="20"/>
+                <w:szCs w:val="20"/>
+              </w:rPr>
+              <w:t>G_FloatState</w:t>
+            </w:r>
+            <w:proofErr w:type="spellEnd"/>
+            <w:r>
+              <w:rPr>
+                <w:b/>
+                <w:sz w:val="20"/>
+                <w:szCs w:val="20"/>
+              </w:rPr>
+              <w:t xml:space="preserve"> – float)</w:t>
             </w:r>
           </w:p>
           <w:p>
@@ -4106,7 +4391,25 @@
                 <w:sz w:val="20"/>
                 <w:szCs w:val="20"/>
               </w:rPr>
-              <w:t>Inventory Resources (G_Inventory – Inventory)</w:t>
+              <w:t>Inventory Resources (</w:t>
+            </w:r>
+            <w:proofErr w:type="spellStart"/>
+            <w:r>
+              <w:rPr>
+                <w:b/>
+                <w:sz w:val="20"/>
+                <w:szCs w:val="20"/>
+              </w:rPr>
+              <w:t>G_Inventory</w:t>
+            </w:r>
+            <w:proofErr w:type="spellEnd"/>
+            <w:r>
+              <w:rPr>
+                <w:b/>
+                <w:sz w:val="20"/>
+                <w:szCs w:val="20"/>
+              </w:rPr>
+              <w:t xml:space="preserve"> – Inventory)</w:t>
             </w:r>
           </w:p>
           <w:p>
@@ -4437,7 +4740,25 @@
                 <w:sz w:val="20"/>
                 <w:szCs w:val="20"/>
               </w:rPr>
-              <w:t>Goal Utility Inputs (derived from U_Value system)</w:t>
+              <w:t xml:space="preserve">Goal Utility Inputs (derived from </w:t>
+            </w:r>
+            <w:proofErr w:type="spellStart"/>
+            <w:r>
+              <w:rPr>
+                <w:b/>
+                <w:sz w:val="20"/>
+                <w:szCs w:val="20"/>
+              </w:rPr>
+              <w:t>U_Value</w:t>
+            </w:r>
+            <w:proofErr w:type="spellEnd"/>
+            <w:r>
+              <w:rPr>
+                <w:b/>
+                <w:sz w:val="20"/>
+                <w:szCs w:val="20"/>
+              </w:rPr>
+              <w:t xml:space="preserve"> system)</w:t>
             </w:r>
           </w:p>
           <w:p>
@@ -4481,7 +4802,25 @@
                 <w:sz w:val="20"/>
                 <w:szCs w:val="20"/>
               </w:rPr>
-              <w:t>Each goal (such as Eat Food or Gather Wood) evaluates current state values through U_Values and response curves to produce a final utility score</w:t>
+              <w:t xml:space="preserve">Each goal (such as Eat Food or Gather Wood) evaluates current state values through </w:t>
+            </w:r>
+            <w:proofErr w:type="spellStart"/>
+            <w:r>
+              <w:rPr>
+                <w:bCs w:val="0"/>
+                <w:sz w:val="20"/>
+                <w:szCs w:val="20"/>
+              </w:rPr>
+              <w:t>U_Values</w:t>
+            </w:r>
+            <w:proofErr w:type="spellEnd"/>
+            <w:r>
+              <w:rPr>
+                <w:bCs w:val="0"/>
+                <w:sz w:val="20"/>
+                <w:szCs w:val="20"/>
+              </w:rPr>
+              <w:t xml:space="preserve"> and response curves to produce a final utility score</w:t>
             </w:r>
           </w:p>
           <w:p>
@@ -5126,7 +5465,23 @@
                 <w:sz w:val="20"/>
                 <w:szCs w:val="20"/>
               </w:rPr>
-              <w:t>Its Utility increases slowly and only becomes relevant when heavily depleted</w:t>
+              <w:t xml:space="preserve">Its Utility increases slowly and only </w:t>
+            </w:r>
+            <w:proofErr w:type="gramStart"/>
+            <w:r>
+              <w:rPr>
+                <w:sz w:val="20"/>
+                <w:szCs w:val="20"/>
+              </w:rPr>
+              <w:t>becomes</w:t>
+            </w:r>
+            <w:proofErr w:type="gramEnd"/>
+            <w:r>
+              <w:rPr>
+                <w:sz w:val="20"/>
+                <w:szCs w:val="20"/>
+              </w:rPr>
+              <w:t xml:space="preserve"> relevant when heavily depleted</w:t>
             </w:r>
           </w:p>
         </w:tc>
@@ -5303,30 +5658,94 @@
                 <w:sz w:val="20"/>
                 <w:szCs w:val="20"/>
               </w:rPr>
-              <w:t>First, each U_Value uses an AnimationCurve to map raw state values (such as hunger or energy) into a non-linear Utility score. This acts as smoothing at the input level by preventing linear or sudden changes and instead allowing gradual increases or sharp rises depending on how the curve is shaped.</w:t>
-            </w:r>
-          </w:p>
-          <w:p>
-            <w:pPr>
-              <w:rPr>
-                <w:sz w:val="20"/>
-                <w:szCs w:val="20"/>
-              </w:rPr>
-            </w:pPr>
-          </w:p>
-          <w:p>
-            <w:pPr>
-              <w:rPr>
-                <w:sz w:val="20"/>
-                <w:szCs w:val="20"/>
-              </w:rPr>
-            </w:pPr>
-            <w:r>
-              <w:rPr>
-                <w:sz w:val="20"/>
-                <w:szCs w:val="20"/>
-              </w:rPr>
-              <w:t xml:space="preserve">Second, the U_Scorer calculates the final goal score by averaging all U_Value results together using a simple </w:t>
+              <w:t xml:space="preserve">First, each </w:t>
+            </w:r>
+            <w:proofErr w:type="spellStart"/>
+            <w:r>
+              <w:rPr>
+                <w:sz w:val="20"/>
+                <w:szCs w:val="20"/>
+              </w:rPr>
+              <w:t>U_Value</w:t>
+            </w:r>
+            <w:proofErr w:type="spellEnd"/>
+            <w:r>
+              <w:rPr>
+                <w:sz w:val="20"/>
+                <w:szCs w:val="20"/>
+              </w:rPr>
+              <w:t xml:space="preserve"> uses an </w:t>
+            </w:r>
+            <w:proofErr w:type="spellStart"/>
+            <w:r>
+              <w:rPr>
+                <w:sz w:val="20"/>
+                <w:szCs w:val="20"/>
+              </w:rPr>
+              <w:t>AnimationCurve</w:t>
+            </w:r>
+            <w:proofErr w:type="spellEnd"/>
+            <w:r>
+              <w:rPr>
+                <w:sz w:val="20"/>
+                <w:szCs w:val="20"/>
+              </w:rPr>
+              <w:t xml:space="preserve"> to map raw state values (such as hunger or energy) into a non-linear Utility score. This acts as smoothing at the input level by preventing linear or sudden changes and instead allowing gradual increases or sharp rises depending on how the curve is shaped.</w:t>
+            </w:r>
+          </w:p>
+          <w:p>
+            <w:pPr>
+              <w:rPr>
+                <w:sz w:val="20"/>
+                <w:szCs w:val="20"/>
+              </w:rPr>
+            </w:pPr>
+          </w:p>
+          <w:p>
+            <w:pPr>
+              <w:rPr>
+                <w:sz w:val="20"/>
+                <w:szCs w:val="20"/>
+              </w:rPr>
+            </w:pPr>
+            <w:r>
+              <w:rPr>
+                <w:sz w:val="20"/>
+                <w:szCs w:val="20"/>
+              </w:rPr>
+              <w:t xml:space="preserve">Second, the </w:t>
+            </w:r>
+            <w:proofErr w:type="spellStart"/>
+            <w:r>
+              <w:rPr>
+                <w:sz w:val="20"/>
+                <w:szCs w:val="20"/>
+              </w:rPr>
+              <w:t>U_Scorer</w:t>
+            </w:r>
+            <w:proofErr w:type="spellEnd"/>
+            <w:r>
+              <w:rPr>
+                <w:sz w:val="20"/>
+                <w:szCs w:val="20"/>
+              </w:rPr>
+              <w:t xml:space="preserve"> calculates the final goal score by averaging all </w:t>
+            </w:r>
+            <w:proofErr w:type="spellStart"/>
+            <w:r>
+              <w:rPr>
+                <w:sz w:val="20"/>
+                <w:szCs w:val="20"/>
+              </w:rPr>
+              <w:t>U_Value</w:t>
+            </w:r>
+            <w:proofErr w:type="spellEnd"/>
+            <w:r>
+              <w:rPr>
+                <w:sz w:val="20"/>
+                <w:szCs w:val="20"/>
+              </w:rPr>
+              <w:t xml:space="preserve"> results together using a simple </w:t>
             </w:r>
             <w:r>
               <w:rPr>
@@ -5410,8 +5829,9 @@
           <w:sz w:val="20"/>
           <w:szCs w:val="20"/>
         </w:rPr>
-        <w:t>Please provide a summary of how you expect these choices will influence the NPC’s behaviour</w:t>
+        <w:t xml:space="preserve">Please provide a summary of how you expect these choices will influence the NPC’s </w:t>
       </w:r>
+      <w:proofErr w:type="gramStart"/>
       <w:r>
         <w:rPr>
           <w:b/>
@@ -5419,7 +5839,7 @@
           <w:sz w:val="20"/>
           <w:szCs w:val="20"/>
         </w:rPr>
-        <w:t xml:space="preserve"> </w:t>
+        <w:t>behaviour</w:t>
       </w:r>
       <w:r>
         <w:rPr>
@@ -5428,7 +5848,26 @@
           <w:sz w:val="20"/>
           <w:szCs w:val="20"/>
         </w:rPr>
-        <w:t xml:space="preserve"> (0/1)</w:t>
+        <w:t xml:space="preserve"> </w:t>
+      </w:r>
+      <w:r>
+        <w:rPr>
+          <w:b/>
+          <w:bCs w:val="0"/>
+          <w:sz w:val="20"/>
+          <w:szCs w:val="20"/>
+        </w:rPr>
+        <w:t xml:space="preserve"> (</w:t>
+      </w:r>
+      <w:proofErr w:type="gramEnd"/>
+      <w:r>
+        <w:rPr>
+          <w:b/>
+          <w:bCs w:val="0"/>
+          <w:sz w:val="20"/>
+          <w:szCs w:val="20"/>
+        </w:rPr>
+        <w:t>0/1)</w:t>
       </w:r>
     </w:p>
     <w:tbl>
@@ -5748,23 +6187,55 @@
                 <w:bCs w:val="0"/>
                 <w:iCs/>
               </w:rPr>
-              <w:t>[Design/In Game GUI</w:t>
-            </w:r>
-            <w:r>
-              <w:rPr>
-                <w:b/>
-                <w:bCs w:val="0"/>
-                <w:iCs/>
-              </w:rPr>
-              <w:t xml:space="preserve"> picture</w:t>
-            </w:r>
-            <w:r>
-              <w:rPr>
-                <w:b/>
-                <w:bCs w:val="0"/>
-                <w:iCs/>
-              </w:rPr>
-              <w:t>]</w:t>
+              <w:t>Main Menu:</w:t>
+            </w:r>
+            <w:r>
+              <w:rPr>
+                <w:b/>
+                <w:bCs w:val="0"/>
+                <w:iCs/>
+              </w:rPr>
+              <w:br/>
+            </w:r>
+            <w:r>
+              <w:rPr>
+                <w:noProof/>
+              </w:rPr>
+              <w:drawing>
+                <wp:inline distT="0" distB="0" distL="0" distR="0" wp14:anchorId="1E089D00" wp14:editId="27C4D835">
+                  <wp:extent cx="5396643" cy="3057957"/>
+                  <wp:effectExtent l="0" t="0" r="0" b="9525"/>
+                  <wp:docPr id="1523843495" name="Picture 1"/>
+                  <wp:cNvGraphicFramePr>
+                    <a:graphicFrameLocks xmlns:a="http://schemas.openxmlformats.org/drawingml/2006/main" noChangeAspect="1"/>
+                  </wp:cNvGraphicFramePr>
+                  <a:graphic xmlns:a="http://schemas.openxmlformats.org/drawingml/2006/main">
+                    <a:graphicData uri="http://schemas.openxmlformats.org/drawingml/2006/picture">
+                      <pic:pic xmlns:pic="http://schemas.openxmlformats.org/drawingml/2006/picture">
+                        <pic:nvPicPr>
+                          <pic:cNvPr id="1523843495" name=""/>
+                          <pic:cNvPicPr/>
+                        </pic:nvPicPr>
+                        <pic:blipFill>
+                          <a:blip r:embed="rId12"/>
+                          <a:stretch>
+                            <a:fillRect/>
+                          </a:stretch>
+                        </pic:blipFill>
+                        <pic:spPr>
+                          <a:xfrm>
+                            <a:off x="0" y="0"/>
+                            <a:ext cx="5414398" cy="3068017"/>
+                          </a:xfrm>
+                          <a:prstGeom prst="rect">
+                            <a:avLst/>
+                          </a:prstGeom>
+                        </pic:spPr>
+                      </pic:pic>
+                    </a:graphicData>
+                  </a:graphic>
+                </wp:inline>
+              </w:drawing>
             </w:r>
           </w:p>
           <w:p>
@@ -5787,26 +6258,32 @@
             <w:pPr>
               <w:spacing w:line="240" w:lineRule="auto"/>
               <w:rPr>
-                <w:iCs/>
-              </w:rPr>
-            </w:pPr>
+                <w:b/>
+                <w:bCs w:val="0"/>
+                <w:iCs/>
+              </w:rPr>
+            </w:pPr>
+            <w:r>
+              <w:rPr>
+                <w:b/>
+                <w:bCs w:val="0"/>
+                <w:iCs/>
+              </w:rPr>
+              <w:t>Element 1 – Game Title and Logo</w:t>
+            </w:r>
           </w:p>
           <w:p>
             <w:pPr>
               <w:spacing w:line="240" w:lineRule="auto"/>
               <w:rPr>
-                <w:b/>
-                <w:bCs w:val="0"/>
-                <w:iCs/>
-              </w:rPr>
-            </w:pPr>
-            <w:r>
-              <w:rPr>
-                <w:b/>
-                <w:bCs w:val="0"/>
-                <w:iCs/>
-              </w:rPr>
-              <w:t>[Element 1]</w:t>
+                <w:iCs/>
+              </w:rPr>
+            </w:pPr>
+            <w:r>
+              <w:rPr>
+                <w:iCs/>
+              </w:rPr>
+              <w:t>This just shows the name of the game and its logo (The logo was generated using ChatGPT)</w:t>
             </w:r>
           </w:p>
           <w:p>
@@ -5816,37 +6293,37 @@
                 <w:iCs/>
               </w:rPr>
             </w:pPr>
-            <w:r>
-              <w:rPr>
-                <w:iCs/>
-              </w:rPr>
-              <w:t>[Element 1 Description]</w:t>
-            </w:r>
           </w:p>
           <w:p>
             <w:pPr>
               <w:spacing w:line="240" w:lineRule="auto"/>
               <w:rPr>
-                <w:iCs/>
-              </w:rPr>
-            </w:pPr>
+                <w:b/>
+                <w:bCs w:val="0"/>
+                <w:iCs/>
+              </w:rPr>
+            </w:pPr>
+            <w:r>
+              <w:rPr>
+                <w:b/>
+                <w:bCs w:val="0"/>
+                <w:iCs/>
+              </w:rPr>
+              <w:t>Element 2 – Start Game button</w:t>
+            </w:r>
           </w:p>
           <w:p>
             <w:pPr>
               <w:spacing w:line="240" w:lineRule="auto"/>
               <w:rPr>
-                <w:b/>
-                <w:bCs w:val="0"/>
-                <w:iCs/>
-              </w:rPr>
-            </w:pPr>
-            <w:r>
-              <w:rPr>
-                <w:b/>
-                <w:bCs w:val="0"/>
-                <w:iCs/>
-              </w:rPr>
-              <w:t>[Element 2]</w:t>
+                <w:iCs/>
+              </w:rPr>
+            </w:pPr>
+            <w:r>
+              <w:rPr>
+                <w:iCs/>
+              </w:rPr>
+              <w:t>This button hides the main menu, and begins the game</w:t>
             </w:r>
           </w:p>
           <w:p>
@@ -5856,37 +6333,37 @@
                 <w:iCs/>
               </w:rPr>
             </w:pPr>
-            <w:r>
-              <w:rPr>
-                <w:iCs/>
-              </w:rPr>
-              <w:t>[Element 2 Description]</w:t>
-            </w:r>
           </w:p>
           <w:p>
             <w:pPr>
               <w:spacing w:line="240" w:lineRule="auto"/>
               <w:rPr>
-                <w:iCs/>
-              </w:rPr>
-            </w:pPr>
+                <w:b/>
+                <w:bCs w:val="0"/>
+                <w:iCs/>
+              </w:rPr>
+            </w:pPr>
+            <w:r>
+              <w:rPr>
+                <w:b/>
+                <w:bCs w:val="0"/>
+                <w:iCs/>
+              </w:rPr>
+              <w:t>Element 3 – Settings button</w:t>
+            </w:r>
           </w:p>
           <w:p>
             <w:pPr>
               <w:spacing w:line="240" w:lineRule="auto"/>
               <w:rPr>
-                <w:b/>
-                <w:bCs w:val="0"/>
-                <w:iCs/>
-              </w:rPr>
-            </w:pPr>
-            <w:r>
-              <w:rPr>
-                <w:b/>
-                <w:bCs w:val="0"/>
-                <w:iCs/>
-              </w:rPr>
-              <w:t>[Element 3 etc…]</w:t>
+                <w:iCs/>
+              </w:rPr>
+            </w:pPr>
+            <w:r>
+              <w:rPr>
+                <w:iCs/>
+              </w:rPr>
+              <w:t>This button hides the main menu, and shows the settings menu</w:t>
             </w:r>
           </w:p>
           <w:p>
@@ -5896,44 +6373,1589 @@
                 <w:iCs/>
               </w:rPr>
             </w:pPr>
-            <w:r>
-              <w:rPr>
-                <w:iCs/>
-              </w:rPr>
-              <w:t xml:space="preserve">[Element </w:t>
-            </w:r>
-            <w:r>
-              <w:rPr>
-                <w:iCs/>
-              </w:rPr>
-              <w:t>3</w:t>
-            </w:r>
-            <w:r>
-              <w:rPr>
-                <w:iCs/>
-              </w:rPr>
-              <w:t xml:space="preserve"> Description</w:t>
-            </w:r>
-            <w:r>
-              <w:rPr>
-                <w:iCs/>
-              </w:rPr>
-              <w:t xml:space="preserve"> etc…</w:t>
-            </w:r>
-            <w:r>
-              <w:rPr>
-                <w:iCs/>
-              </w:rPr>
-              <w:t>]</w:t>
-            </w:r>
           </w:p>
           <w:p>
             <w:pPr>
               <w:spacing w:line="240" w:lineRule="auto"/>
               <w:rPr>
-                <w:iCs/>
-              </w:rPr>
-            </w:pPr>
+                <w:b/>
+                <w:bCs w:val="0"/>
+                <w:iCs/>
+              </w:rPr>
+            </w:pPr>
+            <w:r>
+              <w:rPr>
+                <w:b/>
+                <w:bCs w:val="0"/>
+                <w:iCs/>
+              </w:rPr>
+              <w:t xml:space="preserve">Element </w:t>
+            </w:r>
+            <w:r>
+              <w:rPr>
+                <w:b/>
+                <w:bCs w:val="0"/>
+                <w:iCs/>
+              </w:rPr>
+              <w:t>4</w:t>
+            </w:r>
+            <w:r>
+              <w:rPr>
+                <w:b/>
+                <w:bCs w:val="0"/>
+                <w:iCs/>
+              </w:rPr>
+              <w:t xml:space="preserve"> – </w:t>
+            </w:r>
+            <w:r>
+              <w:rPr>
+                <w:b/>
+                <w:bCs w:val="0"/>
+                <w:iCs/>
+              </w:rPr>
+              <w:t>Quit button</w:t>
+            </w:r>
+          </w:p>
+          <w:p>
+            <w:pPr>
+              <w:spacing w:line="240" w:lineRule="auto"/>
+              <w:rPr>
+                <w:iCs/>
+              </w:rPr>
+            </w:pPr>
+            <w:r>
+              <w:rPr>
+                <w:iCs/>
+              </w:rPr>
+              <w:t>Quits the game instantly</w:t>
+            </w:r>
+          </w:p>
+          <w:p>
+            <w:pPr>
+              <w:spacing w:line="240" w:lineRule="auto"/>
+              <w:rPr>
+                <w:iCs/>
+              </w:rPr>
+            </w:pPr>
+          </w:p>
+          <w:p>
+            <w:pPr>
+              <w:spacing w:line="240" w:lineRule="auto"/>
+              <w:rPr>
+                <w:b/>
+                <w:bCs w:val="0"/>
+                <w:iCs/>
+              </w:rPr>
+            </w:pPr>
+            <w:r>
+              <w:rPr>
+                <w:b/>
+                <w:bCs w:val="0"/>
+                <w:iCs/>
+              </w:rPr>
+              <w:t xml:space="preserve">Element </w:t>
+            </w:r>
+            <w:r>
+              <w:rPr>
+                <w:b/>
+                <w:bCs w:val="0"/>
+                <w:iCs/>
+              </w:rPr>
+              <w:t>5</w:t>
+            </w:r>
+            <w:r>
+              <w:rPr>
+                <w:b/>
+                <w:bCs w:val="0"/>
+                <w:iCs/>
+              </w:rPr>
+              <w:t xml:space="preserve"> – </w:t>
+            </w:r>
+            <w:r>
+              <w:rPr>
+                <w:b/>
+                <w:bCs w:val="0"/>
+                <w:iCs/>
+              </w:rPr>
+              <w:t>Attribution</w:t>
+            </w:r>
+          </w:p>
+          <w:p>
+            <w:pPr>
+              <w:spacing w:line="240" w:lineRule="auto"/>
+              <w:rPr>
+                <w:iCs/>
+              </w:rPr>
+            </w:pPr>
+            <w:r>
+              <w:rPr>
+                <w:iCs/>
+              </w:rPr>
+              <w:t>Just a cheeky credit section</w:t>
+            </w:r>
+          </w:p>
+          <w:p>
+            <w:pPr>
+              <w:spacing w:line="240" w:lineRule="auto"/>
+              <w:rPr>
+                <w:iCs/>
+              </w:rPr>
+            </w:pPr>
+          </w:p>
+          <w:p>
+            <w:pPr>
+              <w:spacing w:line="240" w:lineRule="auto"/>
+              <w:rPr>
+                <w:iCs/>
+              </w:rPr>
+            </w:pPr>
+          </w:p>
+          <w:p>
+            <w:pPr>
+              <w:spacing w:line="240" w:lineRule="auto"/>
+              <w:rPr>
+                <w:iCs/>
+              </w:rPr>
+            </w:pPr>
+          </w:p>
+          <w:p>
+            <w:pPr>
+              <w:spacing w:line="240" w:lineRule="auto"/>
+              <w:rPr>
+                <w:iCs/>
+              </w:rPr>
+            </w:pPr>
+          </w:p>
+          <w:p>
+            <w:pPr>
+              <w:spacing w:line="240" w:lineRule="auto"/>
+              <w:rPr>
+                <w:iCs/>
+              </w:rPr>
+            </w:pPr>
+          </w:p>
+          <w:p>
+            <w:pPr>
+              <w:spacing w:line="240" w:lineRule="auto"/>
+              <w:rPr>
+                <w:iCs/>
+              </w:rPr>
+            </w:pPr>
+          </w:p>
+          <w:p>
+            <w:pPr>
+              <w:spacing w:line="240" w:lineRule="auto"/>
+              <w:jc w:val="center"/>
+              <w:rPr>
+                <w:b/>
+                <w:bCs w:val="0"/>
+                <w:iCs/>
+              </w:rPr>
+            </w:pPr>
+            <w:r>
+              <w:rPr>
+                <w:b/>
+                <w:bCs w:val="0"/>
+                <w:iCs/>
+              </w:rPr>
+              <w:t>Settings Menu:</w:t>
+            </w:r>
+          </w:p>
+          <w:p>
+            <w:pPr>
+              <w:spacing w:line="240" w:lineRule="auto"/>
+              <w:jc w:val="center"/>
+              <w:rPr>
+                <w:iCs/>
+              </w:rPr>
+            </w:pPr>
+            <w:r>
+              <w:rPr>
+                <w:noProof/>
+              </w:rPr>
+              <w:drawing>
+                <wp:inline distT="0" distB="0" distL="0" distR="0" wp14:anchorId="2BF804F2" wp14:editId="5A5D570D">
+                  <wp:extent cx="5447131" cy="3051867"/>
+                  <wp:effectExtent l="0" t="0" r="1270" b="0"/>
+                  <wp:docPr id="1346171896" name="Picture 1"/>
+                  <wp:cNvGraphicFramePr>
+                    <a:graphicFrameLocks xmlns:a="http://schemas.openxmlformats.org/drawingml/2006/main" noChangeAspect="1"/>
+                  </wp:cNvGraphicFramePr>
+                  <a:graphic xmlns:a="http://schemas.openxmlformats.org/drawingml/2006/main">
+                    <a:graphicData uri="http://schemas.openxmlformats.org/drawingml/2006/picture">
+                      <pic:pic xmlns:pic="http://schemas.openxmlformats.org/drawingml/2006/picture">
+                        <pic:nvPicPr>
+                          <pic:cNvPr id="1346171896" name=""/>
+                          <pic:cNvPicPr/>
+                        </pic:nvPicPr>
+                        <pic:blipFill>
+                          <a:blip r:embed="rId13"/>
+                          <a:stretch>
+                            <a:fillRect/>
+                          </a:stretch>
+                        </pic:blipFill>
+                        <pic:spPr>
+                          <a:xfrm>
+                            <a:off x="0" y="0"/>
+                            <a:ext cx="5456841" cy="3057307"/>
+                          </a:xfrm>
+                          <a:prstGeom prst="rect">
+                            <a:avLst/>
+                          </a:prstGeom>
+                        </pic:spPr>
+                      </pic:pic>
+                    </a:graphicData>
+                  </a:graphic>
+                </wp:inline>
+              </w:drawing>
+            </w:r>
+          </w:p>
+          <w:p>
+            <w:pPr>
+              <w:spacing w:line="240" w:lineRule="auto"/>
+              <w:rPr>
+                <w:iCs/>
+              </w:rPr>
+            </w:pPr>
+          </w:p>
+          <w:p>
+            <w:pPr>
+              <w:spacing w:line="240" w:lineRule="auto"/>
+              <w:rPr>
+                <w:b/>
+                <w:bCs w:val="0"/>
+                <w:iCs/>
+              </w:rPr>
+            </w:pPr>
+            <w:r>
+              <w:rPr>
+                <w:b/>
+                <w:bCs w:val="0"/>
+                <w:iCs/>
+              </w:rPr>
+              <w:t>Element 1 – Game Title and Logo</w:t>
+            </w:r>
+          </w:p>
+          <w:p>
+            <w:pPr>
+              <w:spacing w:line="240" w:lineRule="auto"/>
+              <w:rPr>
+                <w:iCs/>
+              </w:rPr>
+            </w:pPr>
+            <w:r>
+              <w:rPr>
+                <w:iCs/>
+              </w:rPr>
+              <w:t>This just shows the name of the game and its logo (The logo was generated using ChatGPT)</w:t>
+            </w:r>
+          </w:p>
+          <w:p>
+            <w:pPr>
+              <w:spacing w:line="240" w:lineRule="auto"/>
+              <w:rPr>
+                <w:iCs/>
+              </w:rPr>
+            </w:pPr>
+          </w:p>
+          <w:p>
+            <w:pPr>
+              <w:spacing w:line="240" w:lineRule="auto"/>
+              <w:rPr>
+                <w:b/>
+                <w:bCs w:val="0"/>
+                <w:iCs/>
+              </w:rPr>
+            </w:pPr>
+            <w:r>
+              <w:rPr>
+                <w:b/>
+                <w:bCs w:val="0"/>
+                <w:iCs/>
+              </w:rPr>
+              <w:t xml:space="preserve">Element 2 – </w:t>
+            </w:r>
+            <w:r>
+              <w:rPr>
+                <w:b/>
+                <w:bCs w:val="0"/>
+                <w:iCs/>
+              </w:rPr>
+              <w:t>Master Volume slider</w:t>
+            </w:r>
+          </w:p>
+          <w:p>
+            <w:pPr>
+              <w:spacing w:line="240" w:lineRule="auto"/>
+              <w:rPr>
+                <w:iCs/>
+              </w:rPr>
+            </w:pPr>
+            <w:r>
+              <w:rPr>
+                <w:iCs/>
+              </w:rPr>
+              <w:t>This is an independent volume slider that adds a modifier to the sound effects and music volume levels, essentially controlling all audio at once</w:t>
+            </w:r>
+          </w:p>
+          <w:p>
+            <w:pPr>
+              <w:spacing w:line="240" w:lineRule="auto"/>
+              <w:rPr>
+                <w:iCs/>
+              </w:rPr>
+            </w:pPr>
+          </w:p>
+          <w:p>
+            <w:pPr>
+              <w:spacing w:line="240" w:lineRule="auto"/>
+              <w:rPr>
+                <w:b/>
+                <w:bCs w:val="0"/>
+                <w:iCs/>
+              </w:rPr>
+            </w:pPr>
+            <w:r>
+              <w:rPr>
+                <w:b/>
+                <w:bCs w:val="0"/>
+                <w:iCs/>
+              </w:rPr>
+              <w:t xml:space="preserve">Element 3 – </w:t>
+            </w:r>
+            <w:r>
+              <w:rPr>
+                <w:b/>
+                <w:bCs w:val="0"/>
+                <w:iCs/>
+              </w:rPr>
+              <w:t>Sound Effects Volume slider</w:t>
+            </w:r>
+          </w:p>
+          <w:p>
+            <w:pPr>
+              <w:spacing w:line="240" w:lineRule="auto"/>
+              <w:rPr>
+                <w:iCs/>
+              </w:rPr>
+            </w:pPr>
+            <w:r>
+              <w:rPr>
+                <w:iCs/>
+              </w:rPr>
+              <w:t xml:space="preserve">Independently controls the </w:t>
+            </w:r>
+            <w:r>
+              <w:rPr>
+                <w:iCs/>
+              </w:rPr>
+              <w:t>sound effects</w:t>
+            </w:r>
+            <w:r>
+              <w:rPr>
+                <w:iCs/>
+              </w:rPr>
+              <w:t xml:space="preserve"> volume in the game</w:t>
+            </w:r>
+          </w:p>
+          <w:p>
+            <w:pPr>
+              <w:spacing w:line="240" w:lineRule="auto"/>
+              <w:rPr>
+                <w:iCs/>
+              </w:rPr>
+            </w:pPr>
+          </w:p>
+          <w:p>
+            <w:pPr>
+              <w:spacing w:line="240" w:lineRule="auto"/>
+              <w:rPr>
+                <w:b/>
+                <w:bCs w:val="0"/>
+                <w:iCs/>
+              </w:rPr>
+            </w:pPr>
+            <w:r>
+              <w:rPr>
+                <w:b/>
+                <w:bCs w:val="0"/>
+                <w:iCs/>
+              </w:rPr>
+              <w:t xml:space="preserve">Element 4 – </w:t>
+            </w:r>
+            <w:r>
+              <w:rPr>
+                <w:b/>
+                <w:bCs w:val="0"/>
+                <w:iCs/>
+              </w:rPr>
+              <w:t>Music Volume slider</w:t>
+            </w:r>
+          </w:p>
+          <w:p>
+            <w:pPr>
+              <w:spacing w:line="240" w:lineRule="auto"/>
+              <w:rPr>
+                <w:iCs/>
+              </w:rPr>
+            </w:pPr>
+            <w:r>
+              <w:rPr>
+                <w:iCs/>
+              </w:rPr>
+              <w:t>Independently controls the music volume in the game</w:t>
+            </w:r>
+          </w:p>
+          <w:p>
+            <w:pPr>
+              <w:spacing w:line="240" w:lineRule="auto"/>
+              <w:rPr>
+                <w:iCs/>
+              </w:rPr>
+            </w:pPr>
+          </w:p>
+          <w:p>
+            <w:pPr>
+              <w:spacing w:line="240" w:lineRule="auto"/>
+              <w:rPr>
+                <w:b/>
+                <w:bCs w:val="0"/>
+                <w:iCs/>
+              </w:rPr>
+            </w:pPr>
+            <w:r>
+              <w:rPr>
+                <w:b/>
+                <w:bCs w:val="0"/>
+                <w:iCs/>
+              </w:rPr>
+              <w:t xml:space="preserve">Element 5 – </w:t>
+            </w:r>
+            <w:r>
+              <w:rPr>
+                <w:b/>
+                <w:bCs w:val="0"/>
+                <w:iCs/>
+              </w:rPr>
+              <w:t>Back button</w:t>
+            </w:r>
+          </w:p>
+          <w:p>
+            <w:pPr>
+              <w:spacing w:line="240" w:lineRule="auto"/>
+              <w:rPr>
+                <w:iCs/>
+              </w:rPr>
+            </w:pPr>
+            <w:r>
+              <w:rPr>
+                <w:iCs/>
+              </w:rPr>
+              <w:t>This hides the settings menu and shows the main menu, essentially returning the player to the main menu</w:t>
+            </w:r>
+          </w:p>
+          <w:p>
+            <w:pPr>
+              <w:spacing w:line="240" w:lineRule="auto"/>
+              <w:rPr>
+                <w:iCs/>
+              </w:rPr>
+            </w:pPr>
+          </w:p>
+          <w:p>
+            <w:pPr>
+              <w:spacing w:line="240" w:lineRule="auto"/>
+              <w:rPr>
+                <w:b/>
+                <w:bCs w:val="0"/>
+                <w:iCs/>
+              </w:rPr>
+            </w:pPr>
+            <w:r>
+              <w:rPr>
+                <w:b/>
+                <w:bCs w:val="0"/>
+                <w:iCs/>
+              </w:rPr>
+              <w:t xml:space="preserve">Element </w:t>
+            </w:r>
+            <w:r>
+              <w:rPr>
+                <w:b/>
+                <w:bCs w:val="0"/>
+                <w:iCs/>
+              </w:rPr>
+              <w:t>6</w:t>
+            </w:r>
+            <w:r>
+              <w:rPr>
+                <w:b/>
+                <w:bCs w:val="0"/>
+                <w:iCs/>
+              </w:rPr>
+              <w:t xml:space="preserve"> – Attribution</w:t>
+            </w:r>
+          </w:p>
+          <w:p>
+            <w:pPr>
+              <w:spacing w:line="240" w:lineRule="auto"/>
+              <w:rPr>
+                <w:iCs/>
+              </w:rPr>
+            </w:pPr>
+            <w:r>
+              <w:rPr>
+                <w:iCs/>
+              </w:rPr>
+              <w:t>Just a cheeky credit section</w:t>
+            </w:r>
+          </w:p>
+          <w:p>
+            <w:pPr>
+              <w:spacing w:line="240" w:lineRule="auto"/>
+              <w:rPr>
+                <w:iCs/>
+              </w:rPr>
+            </w:pPr>
+          </w:p>
+          <w:p>
+            <w:pPr>
+              <w:spacing w:line="240" w:lineRule="auto"/>
+              <w:rPr>
+                <w:iCs/>
+              </w:rPr>
+            </w:pPr>
+          </w:p>
+          <w:p>
+            <w:pPr>
+              <w:spacing w:line="240" w:lineRule="auto"/>
+              <w:rPr>
+                <w:iCs/>
+              </w:rPr>
+            </w:pPr>
+          </w:p>
+          <w:p>
+            <w:pPr>
+              <w:spacing w:line="240" w:lineRule="auto"/>
+              <w:rPr>
+                <w:iCs/>
+              </w:rPr>
+            </w:pPr>
+          </w:p>
+          <w:p>
+            <w:pPr>
+              <w:spacing w:line="240" w:lineRule="auto"/>
+              <w:rPr>
+                <w:iCs/>
+              </w:rPr>
+            </w:pPr>
+          </w:p>
+          <w:p>
+            <w:pPr>
+              <w:spacing w:line="240" w:lineRule="auto"/>
+              <w:rPr>
+                <w:iCs/>
+              </w:rPr>
+            </w:pPr>
+          </w:p>
+          <w:p>
+            <w:pPr>
+              <w:spacing w:line="240" w:lineRule="auto"/>
+              <w:jc w:val="center"/>
+              <w:rPr>
+                <w:b/>
+                <w:bCs w:val="0"/>
+                <w:iCs/>
+              </w:rPr>
+            </w:pPr>
+            <w:r>
+              <w:rPr>
+                <w:b/>
+                <w:bCs w:val="0"/>
+                <w:iCs/>
+              </w:rPr>
+              <w:t>Win Display:</w:t>
+            </w:r>
+          </w:p>
+          <w:p>
+            <w:pPr>
+              <w:spacing w:line="240" w:lineRule="auto"/>
+              <w:jc w:val="center"/>
+              <w:rPr>
+                <w:b/>
+                <w:bCs w:val="0"/>
+                <w:iCs/>
+              </w:rPr>
+            </w:pPr>
+            <w:r>
+              <w:rPr>
+                <w:noProof/>
+              </w:rPr>
+              <w:drawing>
+                <wp:inline distT="0" distB="0" distL="0" distR="0" wp14:anchorId="20A000FF" wp14:editId="69AF78AA">
+                  <wp:extent cx="5750061" cy="3235677"/>
+                  <wp:effectExtent l="0" t="0" r="3175" b="3175"/>
+                  <wp:docPr id="505948975" name="Picture 1"/>
+                  <wp:cNvGraphicFramePr>
+                    <a:graphicFrameLocks xmlns:a="http://schemas.openxmlformats.org/drawingml/2006/main" noChangeAspect="1"/>
+                  </wp:cNvGraphicFramePr>
+                  <a:graphic xmlns:a="http://schemas.openxmlformats.org/drawingml/2006/main">
+                    <a:graphicData uri="http://schemas.openxmlformats.org/drawingml/2006/picture">
+                      <pic:pic xmlns:pic="http://schemas.openxmlformats.org/drawingml/2006/picture">
+                        <pic:nvPicPr>
+                          <pic:cNvPr id="505948975" name=""/>
+                          <pic:cNvPicPr/>
+                        </pic:nvPicPr>
+                        <pic:blipFill>
+                          <a:blip r:embed="rId14"/>
+                          <a:stretch>
+                            <a:fillRect/>
+                          </a:stretch>
+                        </pic:blipFill>
+                        <pic:spPr>
+                          <a:xfrm>
+                            <a:off x="0" y="0"/>
+                            <a:ext cx="5760483" cy="3241542"/>
+                          </a:xfrm>
+                          <a:prstGeom prst="rect">
+                            <a:avLst/>
+                          </a:prstGeom>
+                        </pic:spPr>
+                      </pic:pic>
+                    </a:graphicData>
+                  </a:graphic>
+                </wp:inline>
+              </w:drawing>
+            </w:r>
+          </w:p>
+          <w:p>
+            <w:pPr>
+              <w:spacing w:line="240" w:lineRule="auto"/>
+              <w:jc w:val="center"/>
+              <w:rPr>
+                <w:b/>
+                <w:bCs w:val="0"/>
+                <w:iCs/>
+              </w:rPr>
+            </w:pPr>
+          </w:p>
+          <w:p>
+            <w:pPr>
+              <w:spacing w:line="240" w:lineRule="auto"/>
+              <w:rPr>
+                <w:b/>
+                <w:bCs w:val="0"/>
+                <w:iCs/>
+              </w:rPr>
+            </w:pPr>
+            <w:r>
+              <w:rPr>
+                <w:b/>
+                <w:bCs w:val="0"/>
+                <w:iCs/>
+              </w:rPr>
+              <w:t>Element 1 – Game Title and Logo</w:t>
+            </w:r>
+          </w:p>
+          <w:p>
+            <w:pPr>
+              <w:spacing w:line="240" w:lineRule="auto"/>
+              <w:rPr>
+                <w:iCs/>
+              </w:rPr>
+            </w:pPr>
+            <w:r>
+              <w:rPr>
+                <w:iCs/>
+              </w:rPr>
+              <w:t>This just shows the name of the game and its logo (The logo was generated using ChatGPT)</w:t>
+            </w:r>
+          </w:p>
+          <w:p>
+            <w:pPr>
+              <w:spacing w:line="240" w:lineRule="auto"/>
+              <w:rPr>
+                <w:iCs/>
+              </w:rPr>
+            </w:pPr>
+          </w:p>
+          <w:p>
+            <w:pPr>
+              <w:spacing w:line="240" w:lineRule="auto"/>
+              <w:rPr>
+                <w:b/>
+                <w:bCs w:val="0"/>
+                <w:iCs/>
+              </w:rPr>
+            </w:pPr>
+            <w:r>
+              <w:rPr>
+                <w:b/>
+                <w:bCs w:val="0"/>
+                <w:iCs/>
+              </w:rPr>
+              <w:t xml:space="preserve">Element 2 – </w:t>
+            </w:r>
+            <w:r>
+              <w:rPr>
+                <w:b/>
+                <w:bCs w:val="0"/>
+                <w:iCs/>
+              </w:rPr>
+              <w:t>Win text</w:t>
+            </w:r>
+          </w:p>
+          <w:p>
+            <w:pPr>
+              <w:spacing w:line="240" w:lineRule="auto"/>
+              <w:rPr>
+                <w:iCs/>
+              </w:rPr>
+            </w:pPr>
+            <w:r>
+              <w:rPr>
+                <w:iCs/>
+              </w:rPr>
+              <w:t>This displays to the player that they’ve won the game</w:t>
+            </w:r>
+          </w:p>
+          <w:p>
+            <w:pPr>
+              <w:spacing w:line="240" w:lineRule="auto"/>
+              <w:rPr>
+                <w:iCs/>
+              </w:rPr>
+            </w:pPr>
+          </w:p>
+          <w:p>
+            <w:pPr>
+              <w:spacing w:line="240" w:lineRule="auto"/>
+              <w:rPr>
+                <w:b/>
+                <w:bCs w:val="0"/>
+                <w:iCs/>
+              </w:rPr>
+            </w:pPr>
+            <w:r>
+              <w:rPr>
+                <w:b/>
+                <w:bCs w:val="0"/>
+                <w:iCs/>
+              </w:rPr>
+              <w:t xml:space="preserve">Element 3 – </w:t>
+            </w:r>
+            <w:r>
+              <w:rPr>
+                <w:b/>
+                <w:bCs w:val="0"/>
+                <w:iCs/>
+              </w:rPr>
+              <w:t>Return to menu button</w:t>
+            </w:r>
+          </w:p>
+          <w:p>
+            <w:pPr>
+              <w:spacing w:line="240" w:lineRule="auto"/>
+              <w:rPr>
+                <w:iCs/>
+              </w:rPr>
+            </w:pPr>
+            <w:r>
+              <w:rPr>
+                <w:iCs/>
+              </w:rPr>
+              <w:t>Returns the player the main menu</w:t>
+            </w:r>
+          </w:p>
+          <w:p>
+            <w:pPr>
+              <w:spacing w:line="240" w:lineRule="auto"/>
+              <w:rPr>
+                <w:iCs/>
+              </w:rPr>
+            </w:pPr>
+          </w:p>
+          <w:p>
+            <w:pPr>
+              <w:spacing w:line="240" w:lineRule="auto"/>
+              <w:rPr>
+                <w:b/>
+                <w:bCs w:val="0"/>
+                <w:iCs/>
+              </w:rPr>
+            </w:pPr>
+            <w:r>
+              <w:rPr>
+                <w:b/>
+                <w:bCs w:val="0"/>
+                <w:iCs/>
+              </w:rPr>
+              <w:t>Element 4 – Quit button</w:t>
+            </w:r>
+          </w:p>
+          <w:p>
+            <w:pPr>
+              <w:spacing w:line="240" w:lineRule="auto"/>
+              <w:rPr>
+                <w:iCs/>
+              </w:rPr>
+            </w:pPr>
+            <w:r>
+              <w:rPr>
+                <w:iCs/>
+              </w:rPr>
+              <w:t>Quits the game instantly</w:t>
+            </w:r>
+          </w:p>
+          <w:p>
+            <w:pPr>
+              <w:spacing w:line="240" w:lineRule="auto"/>
+              <w:rPr>
+                <w:iCs/>
+              </w:rPr>
+            </w:pPr>
+          </w:p>
+          <w:p>
+            <w:pPr>
+              <w:spacing w:line="240" w:lineRule="auto"/>
+              <w:rPr>
+                <w:b/>
+                <w:bCs w:val="0"/>
+                <w:iCs/>
+              </w:rPr>
+            </w:pPr>
+            <w:r>
+              <w:rPr>
+                <w:b/>
+                <w:bCs w:val="0"/>
+                <w:iCs/>
+              </w:rPr>
+              <w:t xml:space="preserve">Element </w:t>
+            </w:r>
+            <w:r>
+              <w:rPr>
+                <w:b/>
+                <w:bCs w:val="0"/>
+                <w:iCs/>
+              </w:rPr>
+              <w:t>5</w:t>
+            </w:r>
+            <w:r>
+              <w:rPr>
+                <w:b/>
+                <w:bCs w:val="0"/>
+                <w:iCs/>
+              </w:rPr>
+              <w:t xml:space="preserve"> – Attribution</w:t>
+            </w:r>
+          </w:p>
+          <w:p>
+            <w:pPr>
+              <w:spacing w:line="240" w:lineRule="auto"/>
+              <w:rPr>
+                <w:iCs/>
+              </w:rPr>
+            </w:pPr>
+            <w:r>
+              <w:rPr>
+                <w:iCs/>
+              </w:rPr>
+              <w:t>Just a cheeky credit section</w:t>
+            </w:r>
+          </w:p>
+          <w:p>
+            <w:pPr>
+              <w:spacing w:line="240" w:lineRule="auto"/>
+              <w:rPr>
+                <w:iCs/>
+              </w:rPr>
+            </w:pPr>
+          </w:p>
+          <w:p>
+            <w:pPr>
+              <w:spacing w:line="240" w:lineRule="auto"/>
+              <w:rPr>
+                <w:b/>
+                <w:bCs w:val="0"/>
+                <w:iCs/>
+              </w:rPr>
+            </w:pPr>
+          </w:p>
+          <w:p>
+            <w:pPr>
+              <w:spacing w:line="240" w:lineRule="auto"/>
+              <w:rPr>
+                <w:b/>
+                <w:bCs w:val="0"/>
+                <w:iCs/>
+              </w:rPr>
+            </w:pPr>
+          </w:p>
+          <w:p>
+            <w:pPr>
+              <w:spacing w:line="240" w:lineRule="auto"/>
+              <w:rPr>
+                <w:b/>
+                <w:bCs w:val="0"/>
+                <w:iCs/>
+              </w:rPr>
+            </w:pPr>
+          </w:p>
+          <w:p>
+            <w:pPr>
+              <w:spacing w:line="240" w:lineRule="auto"/>
+              <w:rPr>
+                <w:b/>
+                <w:bCs w:val="0"/>
+                <w:iCs/>
+              </w:rPr>
+            </w:pPr>
+          </w:p>
+          <w:p>
+            <w:pPr>
+              <w:spacing w:line="240" w:lineRule="auto"/>
+              <w:rPr>
+                <w:b/>
+                <w:bCs w:val="0"/>
+                <w:iCs/>
+              </w:rPr>
+            </w:pPr>
+          </w:p>
+          <w:p>
+            <w:pPr>
+              <w:spacing w:line="240" w:lineRule="auto"/>
+              <w:rPr>
+                <w:b/>
+                <w:bCs w:val="0"/>
+                <w:iCs/>
+              </w:rPr>
+            </w:pPr>
+          </w:p>
+          <w:p>
+            <w:pPr>
+              <w:spacing w:line="240" w:lineRule="auto"/>
+              <w:rPr>
+                <w:b/>
+                <w:bCs w:val="0"/>
+                <w:iCs/>
+              </w:rPr>
+            </w:pPr>
+          </w:p>
+          <w:p>
+            <w:pPr>
+              <w:spacing w:line="240" w:lineRule="auto"/>
+              <w:rPr>
+                <w:b/>
+                <w:bCs w:val="0"/>
+                <w:iCs/>
+              </w:rPr>
+            </w:pPr>
+          </w:p>
+          <w:p>
+            <w:pPr>
+              <w:spacing w:line="240" w:lineRule="auto"/>
+              <w:rPr>
+                <w:b/>
+                <w:bCs w:val="0"/>
+                <w:iCs/>
+              </w:rPr>
+            </w:pPr>
+          </w:p>
+          <w:p>
+            <w:pPr>
+              <w:spacing w:line="240" w:lineRule="auto"/>
+              <w:jc w:val="center"/>
+              <w:rPr>
+                <w:b/>
+                <w:bCs w:val="0"/>
+                <w:iCs/>
+              </w:rPr>
+            </w:pPr>
+            <w:r>
+              <w:rPr>
+                <w:b/>
+                <w:bCs w:val="0"/>
+                <w:iCs/>
+              </w:rPr>
+              <w:t>Pause Menu:</w:t>
+            </w:r>
+            <w:r>
+              <w:rPr>
+                <w:b/>
+                <w:bCs w:val="0"/>
+                <w:iCs/>
+              </w:rPr>
+              <w:br/>
+            </w:r>
+            <w:r>
+              <w:rPr>
+                <w:noProof/>
+              </w:rPr>
+              <w:drawing>
+                <wp:inline distT="0" distB="0" distL="0" distR="0" wp14:anchorId="061C2F23" wp14:editId="32CF21F8">
+                  <wp:extent cx="6052991" cy="3402583"/>
+                  <wp:effectExtent l="0" t="0" r="5080" b="7620"/>
+                  <wp:docPr id="566313040" name="Picture 1"/>
+                  <wp:cNvGraphicFramePr>
+                    <a:graphicFrameLocks xmlns:a="http://schemas.openxmlformats.org/drawingml/2006/main" noChangeAspect="1"/>
+                  </wp:cNvGraphicFramePr>
+                  <a:graphic xmlns:a="http://schemas.openxmlformats.org/drawingml/2006/main">
+                    <a:graphicData uri="http://schemas.openxmlformats.org/drawingml/2006/picture">
+                      <pic:pic xmlns:pic="http://schemas.openxmlformats.org/drawingml/2006/picture">
+                        <pic:nvPicPr>
+                          <pic:cNvPr id="566313040" name=""/>
+                          <pic:cNvPicPr/>
+                        </pic:nvPicPr>
+                        <pic:blipFill>
+                          <a:blip r:embed="rId15"/>
+                          <a:stretch>
+                            <a:fillRect/>
+                          </a:stretch>
+                        </pic:blipFill>
+                        <pic:spPr>
+                          <a:xfrm>
+                            <a:off x="0" y="0"/>
+                            <a:ext cx="6061274" cy="3407239"/>
+                          </a:xfrm>
+                          <a:prstGeom prst="rect">
+                            <a:avLst/>
+                          </a:prstGeom>
+                        </pic:spPr>
+                      </pic:pic>
+                    </a:graphicData>
+                  </a:graphic>
+                </wp:inline>
+              </w:drawing>
+            </w:r>
+          </w:p>
+          <w:p>
+            <w:pPr>
+              <w:spacing w:line="240" w:lineRule="auto"/>
+              <w:jc w:val="center"/>
+              <w:rPr>
+                <w:b/>
+                <w:bCs w:val="0"/>
+                <w:iCs/>
+              </w:rPr>
+            </w:pPr>
+          </w:p>
+          <w:p>
+            <w:pPr>
+              <w:spacing w:line="240" w:lineRule="auto"/>
+              <w:rPr>
+                <w:b/>
+                <w:bCs w:val="0"/>
+                <w:iCs/>
+              </w:rPr>
+            </w:pPr>
+            <w:r>
+              <w:rPr>
+                <w:b/>
+                <w:bCs w:val="0"/>
+                <w:iCs/>
+              </w:rPr>
+              <w:t>Element 1 – Game Title and Logo</w:t>
+            </w:r>
+          </w:p>
+          <w:p>
+            <w:pPr>
+              <w:spacing w:line="240" w:lineRule="auto"/>
+              <w:rPr>
+                <w:iCs/>
+              </w:rPr>
+            </w:pPr>
+            <w:r>
+              <w:rPr>
+                <w:iCs/>
+              </w:rPr>
+              <w:t>This just shows the name of the game and its logo (The logo was generated using ChatGPT)</w:t>
+            </w:r>
+          </w:p>
+          <w:p>
+            <w:pPr>
+              <w:spacing w:line="240" w:lineRule="auto"/>
+              <w:rPr>
+                <w:iCs/>
+              </w:rPr>
+            </w:pPr>
+          </w:p>
+          <w:p>
+            <w:pPr>
+              <w:spacing w:line="240" w:lineRule="auto"/>
+              <w:rPr>
+                <w:b/>
+                <w:bCs w:val="0"/>
+                <w:iCs/>
+              </w:rPr>
+            </w:pPr>
+            <w:r>
+              <w:rPr>
+                <w:b/>
+                <w:bCs w:val="0"/>
+                <w:iCs/>
+              </w:rPr>
+              <w:t xml:space="preserve">Element 2 – </w:t>
+            </w:r>
+            <w:r>
+              <w:rPr>
+                <w:b/>
+                <w:bCs w:val="0"/>
+                <w:iCs/>
+              </w:rPr>
+              <w:t>Resume button</w:t>
+            </w:r>
+          </w:p>
+          <w:p>
+            <w:pPr>
+              <w:spacing w:line="240" w:lineRule="auto"/>
+              <w:rPr>
+                <w:iCs/>
+              </w:rPr>
+            </w:pPr>
+            <w:r>
+              <w:rPr>
+                <w:iCs/>
+              </w:rPr>
+              <w:t>This resumes time scale back to 1 and resumes the game</w:t>
+            </w:r>
+          </w:p>
+          <w:p>
+            <w:pPr>
+              <w:spacing w:line="240" w:lineRule="auto"/>
+              <w:rPr>
+                <w:iCs/>
+              </w:rPr>
+            </w:pPr>
+          </w:p>
+          <w:p>
+            <w:pPr>
+              <w:spacing w:line="240" w:lineRule="auto"/>
+              <w:rPr>
+                <w:b/>
+                <w:bCs w:val="0"/>
+                <w:iCs/>
+              </w:rPr>
+            </w:pPr>
+            <w:r>
+              <w:rPr>
+                <w:b/>
+                <w:bCs w:val="0"/>
+                <w:iCs/>
+              </w:rPr>
+              <w:t>Element 3 – Return to menu button</w:t>
+            </w:r>
+          </w:p>
+          <w:p>
+            <w:pPr>
+              <w:spacing w:line="240" w:lineRule="auto"/>
+              <w:rPr>
+                <w:iCs/>
+              </w:rPr>
+            </w:pPr>
+            <w:r>
+              <w:rPr>
+                <w:iCs/>
+              </w:rPr>
+              <w:t>Returns the player the main menu</w:t>
+            </w:r>
+          </w:p>
+          <w:p>
+            <w:pPr>
+              <w:spacing w:line="240" w:lineRule="auto"/>
+              <w:rPr>
+                <w:iCs/>
+              </w:rPr>
+            </w:pPr>
+          </w:p>
+          <w:p>
+            <w:pPr>
+              <w:spacing w:line="240" w:lineRule="auto"/>
+              <w:rPr>
+                <w:b/>
+                <w:bCs w:val="0"/>
+                <w:iCs/>
+              </w:rPr>
+            </w:pPr>
+            <w:r>
+              <w:rPr>
+                <w:b/>
+                <w:bCs w:val="0"/>
+                <w:iCs/>
+              </w:rPr>
+              <w:t>Element 4 – Quit button</w:t>
+            </w:r>
+          </w:p>
+          <w:p>
+            <w:pPr>
+              <w:spacing w:line="240" w:lineRule="auto"/>
+              <w:rPr>
+                <w:iCs/>
+              </w:rPr>
+            </w:pPr>
+            <w:r>
+              <w:rPr>
+                <w:iCs/>
+              </w:rPr>
+              <w:t>Quits the game instantly</w:t>
+            </w:r>
+          </w:p>
+          <w:p>
+            <w:pPr>
+              <w:spacing w:line="240" w:lineRule="auto"/>
+              <w:rPr>
+                <w:iCs/>
+              </w:rPr>
+            </w:pPr>
+          </w:p>
+          <w:p>
+            <w:pPr>
+              <w:spacing w:line="240" w:lineRule="auto"/>
+              <w:rPr>
+                <w:b/>
+                <w:bCs w:val="0"/>
+                <w:iCs/>
+              </w:rPr>
+            </w:pPr>
+            <w:r>
+              <w:rPr>
+                <w:b/>
+                <w:bCs w:val="0"/>
+                <w:iCs/>
+              </w:rPr>
+              <w:t>Element 5 – Attribution</w:t>
+            </w:r>
+          </w:p>
+          <w:p>
+            <w:pPr>
+              <w:spacing w:line="240" w:lineRule="auto"/>
+              <w:rPr>
+                <w:iCs/>
+              </w:rPr>
+            </w:pPr>
+            <w:r>
+              <w:rPr>
+                <w:iCs/>
+              </w:rPr>
+              <w:t>Just a cheeky credit section</w:t>
+            </w:r>
+          </w:p>
+          <w:p>
+            <w:pPr>
+              <w:spacing w:line="240" w:lineRule="auto"/>
+              <w:jc w:val="center"/>
+              <w:rPr>
+                <w:b/>
+                <w:bCs w:val="0"/>
+                <w:iCs/>
+              </w:rPr>
+            </w:pPr>
+          </w:p>
+          <w:p>
+            <w:pPr>
+              <w:spacing w:line="240" w:lineRule="auto"/>
+              <w:jc w:val="center"/>
+              <w:rPr>
+                <w:b/>
+                <w:bCs w:val="0"/>
+                <w:iCs/>
+              </w:rPr>
+            </w:pPr>
+          </w:p>
+          <w:p>
+            <w:pPr>
+              <w:spacing w:line="240" w:lineRule="auto"/>
+              <w:jc w:val="center"/>
+              <w:rPr>
+                <w:b/>
+                <w:bCs w:val="0"/>
+                <w:iCs/>
+              </w:rPr>
+            </w:pPr>
+          </w:p>
+          <w:p>
+            <w:pPr>
+              <w:spacing w:line="240" w:lineRule="auto"/>
+              <w:jc w:val="center"/>
+              <w:rPr>
+                <w:b/>
+                <w:bCs w:val="0"/>
+                <w:iCs/>
+              </w:rPr>
+            </w:pPr>
+          </w:p>
+          <w:p>
+            <w:pPr>
+              <w:spacing w:line="240" w:lineRule="auto"/>
+              <w:jc w:val="center"/>
+              <w:rPr>
+                <w:b/>
+                <w:bCs w:val="0"/>
+                <w:iCs/>
+              </w:rPr>
+            </w:pPr>
+          </w:p>
+          <w:p>
+            <w:pPr>
+              <w:spacing w:line="240" w:lineRule="auto"/>
+              <w:jc w:val="center"/>
+              <w:rPr>
+                <w:b/>
+                <w:bCs w:val="0"/>
+                <w:iCs/>
+              </w:rPr>
+            </w:pPr>
+          </w:p>
+          <w:p>
+            <w:pPr>
+              <w:spacing w:line="240" w:lineRule="auto"/>
+              <w:jc w:val="center"/>
+              <w:rPr>
+                <w:b/>
+                <w:bCs w:val="0"/>
+                <w:iCs/>
+              </w:rPr>
+            </w:pPr>
+          </w:p>
+          <w:p>
+            <w:pPr>
+              <w:spacing w:line="240" w:lineRule="auto"/>
+              <w:jc w:val="center"/>
+              <w:rPr>
+                <w:b/>
+                <w:bCs w:val="0"/>
+                <w:iCs/>
+              </w:rPr>
+            </w:pPr>
+          </w:p>
+          <w:p>
+            <w:pPr>
+              <w:spacing w:line="240" w:lineRule="auto"/>
+              <w:jc w:val="center"/>
+              <w:rPr>
+                <w:b/>
+                <w:bCs w:val="0"/>
+                <w:iCs/>
+              </w:rPr>
+            </w:pPr>
+            <w:r>
+              <w:rPr>
+                <w:b/>
+                <w:bCs w:val="0"/>
+                <w:iCs/>
+              </w:rPr>
+              <w:t>Game Play Screen:</w:t>
+            </w:r>
+            <w:r>
+              <w:rPr>
+                <w:b/>
+                <w:bCs w:val="0"/>
+                <w:iCs/>
+              </w:rPr>
+              <w:br/>
+            </w:r>
+            <w:r>
+              <w:rPr>
+                <w:noProof/>
+              </w:rPr>
+              <w:drawing>
+                <wp:inline distT="0" distB="0" distL="0" distR="0" wp14:anchorId="018766AB" wp14:editId="326FEFB7">
+                  <wp:extent cx="5076883" cy="2867812"/>
+                  <wp:effectExtent l="0" t="0" r="0" b="8890"/>
+                  <wp:docPr id="2120799634" name="Picture 1"/>
+                  <wp:cNvGraphicFramePr>
+                    <a:graphicFrameLocks xmlns:a="http://schemas.openxmlformats.org/drawingml/2006/main" noChangeAspect="1"/>
+                  </wp:cNvGraphicFramePr>
+                  <a:graphic xmlns:a="http://schemas.openxmlformats.org/drawingml/2006/main">
+                    <a:graphicData uri="http://schemas.openxmlformats.org/drawingml/2006/picture">
+                      <pic:pic xmlns:pic="http://schemas.openxmlformats.org/drawingml/2006/picture">
+                        <pic:nvPicPr>
+                          <pic:cNvPr id="2120799634" name=""/>
+                          <pic:cNvPicPr/>
+                        </pic:nvPicPr>
+                        <pic:blipFill>
+                          <a:blip r:embed="rId16"/>
+                          <a:stretch>
+                            <a:fillRect/>
+                          </a:stretch>
+                        </pic:blipFill>
+                        <pic:spPr>
+                          <a:xfrm>
+                            <a:off x="0" y="0"/>
+                            <a:ext cx="5083595" cy="2871603"/>
+                          </a:xfrm>
+                          <a:prstGeom prst="rect">
+                            <a:avLst/>
+                          </a:prstGeom>
+                        </pic:spPr>
+                      </pic:pic>
+                    </a:graphicData>
+                  </a:graphic>
+                </wp:inline>
+              </w:drawing>
+            </w:r>
+          </w:p>
+          <w:p>
+            <w:pPr>
+              <w:spacing w:line="240" w:lineRule="auto"/>
+              <w:jc w:val="center"/>
+              <w:rPr>
+                <w:b/>
+                <w:bCs w:val="0"/>
+                <w:iCs/>
+              </w:rPr>
+            </w:pPr>
+          </w:p>
+          <w:p>
+            <w:pPr>
+              <w:spacing w:line="240" w:lineRule="auto"/>
+              <w:rPr>
+                <w:b/>
+                <w:bCs w:val="0"/>
+                <w:iCs/>
+              </w:rPr>
+            </w:pPr>
+            <w:r>
+              <w:rPr>
+                <w:b/>
+                <w:bCs w:val="0"/>
+                <w:iCs/>
+              </w:rPr>
+              <w:t xml:space="preserve">Element 1 </w:t>
+            </w:r>
+            <w:r>
+              <w:rPr>
+                <w:b/>
+                <w:bCs w:val="0"/>
+                <w:iCs/>
+              </w:rPr>
+              <w:t>– Pause button</w:t>
+            </w:r>
+          </w:p>
+          <w:p>
+            <w:pPr>
+              <w:spacing w:line="240" w:lineRule="auto"/>
+              <w:rPr>
+                <w:iCs/>
+              </w:rPr>
+            </w:pPr>
+            <w:r>
+              <w:rPr>
+                <w:iCs/>
+              </w:rPr>
+              <w:t>This sets the time scale to 0 and brings up the pause menu</w:t>
+            </w:r>
+          </w:p>
+          <w:p>
+            <w:pPr>
+              <w:spacing w:line="240" w:lineRule="auto"/>
+              <w:rPr>
+                <w:iCs/>
+              </w:rPr>
+            </w:pPr>
+          </w:p>
+          <w:p>
+            <w:pPr>
+              <w:spacing w:line="240" w:lineRule="auto"/>
+              <w:rPr>
+                <w:b/>
+                <w:bCs w:val="0"/>
+                <w:iCs/>
+              </w:rPr>
+            </w:pPr>
+            <w:r>
+              <w:rPr>
+                <w:b/>
+                <w:bCs w:val="0"/>
+                <w:iCs/>
+              </w:rPr>
+              <w:t xml:space="preserve">Element 2 – </w:t>
+            </w:r>
+            <w:r>
+              <w:rPr>
+                <w:b/>
+                <w:bCs w:val="0"/>
+                <w:iCs/>
+              </w:rPr>
+              <w:t>Resource counter</w:t>
+            </w:r>
+          </w:p>
+          <w:p>
+            <w:pPr>
+              <w:spacing w:line="240" w:lineRule="auto"/>
+              <w:rPr>
+                <w:iCs/>
+              </w:rPr>
+            </w:pPr>
+            <w:r>
+              <w:rPr>
+                <w:iCs/>
+              </w:rPr>
+              <w:t xml:space="preserve">This </w:t>
+            </w:r>
+            <w:r>
+              <w:rPr>
+                <w:iCs/>
+              </w:rPr>
+              <w:t>shows the player the current number of collected resources</w:t>
+            </w:r>
+          </w:p>
+          <w:p>
+            <w:pPr>
+              <w:spacing w:line="240" w:lineRule="auto"/>
+              <w:rPr>
+                <w:iCs/>
+              </w:rPr>
+            </w:pPr>
+          </w:p>
+          <w:p>
+            <w:pPr>
+              <w:spacing w:line="240" w:lineRule="auto"/>
+              <w:rPr>
+                <w:b/>
+                <w:bCs w:val="0"/>
+                <w:iCs/>
+              </w:rPr>
+            </w:pPr>
+            <w:r>
+              <w:rPr>
+                <w:b/>
+                <w:bCs w:val="0"/>
+                <w:iCs/>
+              </w:rPr>
+              <w:t xml:space="preserve">Element 3 – </w:t>
+            </w:r>
+            <w:proofErr w:type="spellStart"/>
+            <w:r>
+              <w:rPr>
+                <w:b/>
+                <w:bCs w:val="0"/>
+                <w:iCs/>
+              </w:rPr>
+              <w:t>Gameplay</w:t>
+            </w:r>
+            <w:proofErr w:type="spellEnd"/>
+            <w:r>
+              <w:rPr>
+                <w:b/>
+                <w:bCs w:val="0"/>
+                <w:iCs/>
+              </w:rPr>
+              <w:t xml:space="preserve"> field</w:t>
+            </w:r>
+          </w:p>
+          <w:p>
+            <w:pPr>
+              <w:spacing w:line="240" w:lineRule="auto"/>
+              <w:rPr>
+                <w:iCs/>
+              </w:rPr>
+            </w:pPr>
+            <w:r>
+              <w:rPr>
+                <w:iCs/>
+              </w:rPr>
+              <w:t>The rest of the screen is the gameplay field. The player will watch the NPCs go about their lives in this section</w:t>
+            </w:r>
           </w:p>
         </w:tc>
       </w:tr>
@@ -6032,7 +8054,15 @@
         <w:spacing w:line="240" w:lineRule="auto"/>
       </w:pPr>
       <w:r>
-        <w:t>Use the table below to list and record any and all 3</w:t>
+        <w:t xml:space="preserve">Use the table below to list and record </w:t>
+      </w:r>
+      <w:proofErr w:type="gramStart"/>
+      <w:r>
+        <w:t>any and all</w:t>
+      </w:r>
+      <w:proofErr w:type="gramEnd"/>
+      <w:r>
+        <w:t xml:space="preserve"> 3</w:t>
       </w:r>
       <w:r>
         <w:rPr>
@@ -6057,10 +8087,10 @@
         <w:tblLook w:val="04A0" w:firstRow="1" w:lastRow="0" w:firstColumn="1" w:lastColumn="0" w:noHBand="0" w:noVBand="1"/>
       </w:tblPr>
       <w:tblGrid>
-        <w:gridCol w:w="2268"/>
-        <w:gridCol w:w="2268"/>
-        <w:gridCol w:w="2410"/>
-        <w:gridCol w:w="2998"/>
+        <w:gridCol w:w="1510"/>
+        <w:gridCol w:w="1238"/>
+        <w:gridCol w:w="1252"/>
+        <w:gridCol w:w="6057"/>
       </w:tblGrid>
       <w:tr>
         <w:tc>
@@ -6148,6 +8178,9 @@
               <w:spacing w:line="240" w:lineRule="auto"/>
               <w:ind w:left="0"/>
             </w:pPr>
+            <w:r>
+              <w:t>Tree Type0 06</w:t>
+            </w:r>
           </w:p>
         </w:tc>
         <w:tc>
@@ -6160,6 +8193,9 @@
               <w:spacing w:line="240" w:lineRule="auto"/>
               <w:ind w:left="0"/>
             </w:pPr>
+            <w:r>
+              <w:t>Broken Vector</w:t>
+            </w:r>
           </w:p>
         </w:tc>
         <w:tc>
@@ -6172,6 +8208,9 @@
               <w:spacing w:line="240" w:lineRule="auto"/>
               <w:ind w:left="0"/>
             </w:pPr>
+            <w:r>
+              <w:t>Extension Asset</w:t>
+            </w:r>
           </w:p>
         </w:tc>
         <w:tc>
@@ -6184,6 +8223,17 @@
               <w:spacing w:line="240" w:lineRule="auto"/>
               <w:ind w:left="0"/>
             </w:pPr>
+            <w:hyperlink r:id="rId17" w:history="1">
+              <w:r>
+                <w:rPr>
+                  <w:rStyle w:val="Hyperlink"/>
+                </w:rPr>
+                <w:t>https://assetstore.unity.com/packages/3d/vegetation/trees/low-poly-tree-pack-57866</w:t>
+              </w:r>
+            </w:hyperlink>
+            <w:r>
+              <w:t xml:space="preserve"> </w:t>
+            </w:r>
           </w:p>
         </w:tc>
       </w:tr>
@@ -6198,6 +8248,9 @@
               <w:spacing w:line="240" w:lineRule="auto"/>
               <w:ind w:left="0"/>
             </w:pPr>
+            <w:r>
+              <w:t>Not implemented yet</w:t>
+            </w:r>
           </w:p>
         </w:tc>
         <w:tc>
@@ -6210,6 +8263,9 @@
               <w:spacing w:line="240" w:lineRule="auto"/>
               <w:ind w:left="0"/>
             </w:pPr>
+            <w:r>
+              <w:t>Broken Vector</w:t>
+            </w:r>
           </w:p>
         </w:tc>
         <w:tc>
@@ -6222,6 +8278,9 @@
               <w:spacing w:line="240" w:lineRule="auto"/>
               <w:ind w:left="0"/>
             </w:pPr>
+            <w:r>
+              <w:t>Extension Asset</w:t>
+            </w:r>
           </w:p>
         </w:tc>
         <w:tc>
@@ -6234,6 +8293,17 @@
               <w:spacing w:line="240" w:lineRule="auto"/>
               <w:ind w:left="0"/>
             </w:pPr>
+            <w:hyperlink r:id="rId18" w:history="1">
+              <w:r>
+                <w:rPr>
+                  <w:rStyle w:val="Hyperlink"/>
+                </w:rPr>
+                <w:t>https://assetstore.unity.com/packages/p/low-poly-rock-pack-57874</w:t>
+              </w:r>
+            </w:hyperlink>
+            <w:r>
+              <w:t xml:space="preserve"> </w:t>
+            </w:r>
           </w:p>
         </w:tc>
       </w:tr>
@@ -6248,6 +8318,32 @@
               <w:spacing w:line="240" w:lineRule="auto"/>
               <w:ind w:left="0"/>
             </w:pPr>
+            <w:r>
+              <w:t>Implemented in “</w:t>
+            </w:r>
+            <w:r>
+              <w:t xml:space="preserve">Prototype 1 </w:t>
+            </w:r>
+            <w:r>
+              <w:t>–</w:t>
+            </w:r>
+            <w:r>
+              <w:t xml:space="preserve"> </w:t>
+            </w:r>
+            <w:proofErr w:type="spellStart"/>
+            <w:r>
+              <w:t>A</w:t>
+            </w:r>
+            <w:r>
+              <w:t>s</w:t>
+            </w:r>
+            <w:r>
+              <w:t>tar</w:t>
+            </w:r>
+            <w:proofErr w:type="spellEnd"/>
+            <w:r>
+              <w:t>” Scene on NPC and A* Map, both in the “Level” sub folder</w:t>
+            </w:r>
           </w:p>
         </w:tc>
         <w:tc>
@@ -6260,6 +8356,9 @@
               <w:spacing w:line="240" w:lineRule="auto"/>
               <w:ind w:left="0"/>
             </w:pPr>
+            <w:r>
+              <w:t>Aron Granberg</w:t>
+            </w:r>
           </w:p>
         </w:tc>
         <w:tc>
@@ -6272,6 +8371,9 @@
               <w:spacing w:line="240" w:lineRule="auto"/>
               <w:ind w:left="0"/>
             </w:pPr>
+            <w:r>
+              <w:t>Extension Asset</w:t>
+            </w:r>
           </w:p>
         </w:tc>
         <w:tc>
@@ -6284,6 +8386,32 @@
               <w:spacing w:line="240" w:lineRule="auto"/>
               <w:ind w:left="0"/>
             </w:pPr>
+            <w:hyperlink r:id="rId19" w:history="1">
+              <w:r>
+                <w:rPr>
+                  <w:rStyle w:val="Hyperlink"/>
+                </w:rPr>
+                <w:t>https://arongranberg.com/astar/</w:t>
+              </w:r>
+            </w:hyperlink>
+          </w:p>
+          <w:p>
+            <w:pPr>
+              <w:pStyle w:val="ListParagraph"/>
+              <w:spacing w:line="240" w:lineRule="auto"/>
+              <w:ind w:left="0"/>
+            </w:pPr>
+            <w:hyperlink r:id="rId20" w:history="1">
+              <w:r>
+                <w:rPr>
+                  <w:rStyle w:val="Hyperlink"/>
+                </w:rPr>
+                <w:t>https://assetstore.unity.com/packages/tools/behavior-ai/a-pathfinding-project-pro-87744?aid=1011l7JId</w:t>
+              </w:r>
+            </w:hyperlink>
+            <w:r>
+              <w:t xml:space="preserve"> </w:t>
+            </w:r>
           </w:p>
         </w:tc>
       </w:tr>
@@ -6378,7 +8506,21 @@
         <w:rPr>
           <w:szCs w:val="22"/>
         </w:rPr>
-        <w:t>Now you will need to create a prototype version of the project. It will not need to include the Assets sourced in Assets attribution but it must satisfy the following requirements:</w:t>
+        <w:t xml:space="preserve">Now you will need to create a prototype version of the project. It will not need to include the Assets sourced in Assets </w:t>
+      </w:r>
+      <w:proofErr w:type="gramStart"/>
+      <w:r>
+        <w:rPr>
+          <w:szCs w:val="22"/>
+        </w:rPr>
+        <w:t>attribution</w:t>
+      </w:r>
+      <w:proofErr w:type="gramEnd"/>
+      <w:r>
+        <w:rPr>
+          <w:szCs w:val="22"/>
+        </w:rPr>
+        <w:t xml:space="preserve"> but it must satisfy the following requirements:</w:t>
       </w:r>
     </w:p>
     <w:p>
@@ -6750,6 +8892,47 @@
                 <w:szCs w:val="22"/>
               </w:rPr>
             </w:pPr>
+            <w:r>
+              <w:rPr>
+                <w:noProof/>
+              </w:rPr>
+              <w:lastRenderedPageBreak/>
+              <w:drawing>
+                <wp:inline distT="0" distB="0" distL="0" distR="0" wp14:anchorId="3F14C36F" wp14:editId="3E7F28D3">
+                  <wp:extent cx="2244002" cy="7232798"/>
+                  <wp:effectExtent l="0" t="0" r="4445" b="6350"/>
+                  <wp:docPr id="558244512" name="Picture 1"/>
+                  <wp:cNvGraphicFramePr>
+                    <a:graphicFrameLocks xmlns:a="http://schemas.openxmlformats.org/drawingml/2006/main" noChangeAspect="1"/>
+                  </wp:cNvGraphicFramePr>
+                  <a:graphic xmlns:a="http://schemas.openxmlformats.org/drawingml/2006/main">
+                    <a:graphicData uri="http://schemas.openxmlformats.org/drawingml/2006/picture">
+                      <pic:pic xmlns:pic="http://schemas.openxmlformats.org/drawingml/2006/picture">
+                        <pic:nvPicPr>
+                          <pic:cNvPr id="558244512" name=""/>
+                          <pic:cNvPicPr/>
+                        </pic:nvPicPr>
+                        <pic:blipFill>
+                          <a:blip r:embed="rId21"/>
+                          <a:stretch>
+                            <a:fillRect/>
+                          </a:stretch>
+                        </pic:blipFill>
+                        <pic:spPr>
+                          <a:xfrm>
+                            <a:off x="0" y="0"/>
+                            <a:ext cx="2250576" cy="7253986"/>
+                          </a:xfrm>
+                          <a:prstGeom prst="rect">
+                            <a:avLst/>
+                          </a:prstGeom>
+                        </pic:spPr>
+                      </pic:pic>
+                    </a:graphicData>
+                  </a:graphic>
+                </wp:inline>
+              </w:drawing>
+            </w:r>
           </w:p>
           <w:p>
             <w:pPr>
@@ -6795,8 +8978,8 @@
       </w:pPr>
     </w:p>
     <w:sectPr>
-      <w:headerReference w:type="default" r:id="rId12"/>
-      <w:footerReference w:type="default" r:id="rId13"/>
+      <w:headerReference w:type="default" r:id="rId22"/>
+      <w:footerReference w:type="default" r:id="rId23"/>
       <w:pgSz w:w="11906" w:h="16838" w:code="9"/>
       <w:pgMar w:top="851" w:right="851" w:bottom="851" w:left="851" w:header="567" w:footer="342" w:gutter="0"/>
       <w:cols w:space="720"/>
@@ -13929,7 +16112,7 @@
   <w:style w:type="paragraph" w:default="1" w:styleId="Normal">
     <w:name w:val="Normal"/>
     <w:qFormat/>
-    <w:rsid w:val="000A3892"/>
+    <w:rsid w:val="00C07B9D"/>
     <w:pPr>
       <w:spacing w:line="276" w:lineRule="auto"/>
     </w:pPr>
@@ -14415,6 +16598,28 @@
       <w:color w:val="808080"/>
     </w:rPr>
   </w:style>
+  <w:style w:type="character" w:styleId="Hyperlink">
+    <w:name w:val="Hyperlink"/>
+    <w:basedOn w:val="DefaultParagraphFont"/>
+    <w:unhideWhenUsed/>
+    <w:rsid w:val="0067626F"/>
+    <w:rPr>
+      <w:color w:val="0000FF" w:themeColor="hyperlink"/>
+      <w:u w:val="single"/>
+    </w:rPr>
+  </w:style>
+  <w:style w:type="character" w:styleId="UnresolvedMention">
+    <w:name w:val="Unresolved Mention"/>
+    <w:basedOn w:val="DefaultParagraphFont"/>
+    <w:uiPriority w:val="99"/>
+    <w:semiHidden/>
+    <w:unhideWhenUsed/>
+    <w:rsid w:val="0067626F"/>
+    <w:rPr>
+      <w:color w:val="605E5C"/>
+      <w:shd w:val="clear" w:color="auto" w:fill="E1DFDD"/>
+    </w:rPr>
+  </w:style>
 </w:styles>
 </file>
 
@@ -14578,6 +16783,7 @@
     <w:rsid w:val="00277740"/>
     <w:rsid w:val="002A7697"/>
     <w:rsid w:val="00356E4F"/>
+    <w:rsid w:val="005408F1"/>
     <w:rsid w:val="00586704"/>
     <w:rsid w:val="005D3C19"/>
     <w:rsid w:val="005D56E3"/>
@@ -14589,6 +16795,7 @@
     <w:rsid w:val="00AB257B"/>
     <w:rsid w:val="00C545D8"/>
     <w:rsid w:val="00E44F2C"/>
+    <w:rsid w:val="00F503D6"/>
     <w:rsid w:val="00F61097"/>
     <w:rsid w:val="00FD45B2"/>
   </w:rsids>
@@ -15358,6 +17565,43 @@
 </file>
 
 <file path=customXml/item1.xml><?xml version="1.0" encoding="utf-8"?>
+<b:Sources xmlns:b="http://schemas.openxmlformats.org/officeDocument/2006/bibliography" xmlns="http://schemas.openxmlformats.org/officeDocument/2006/bibliography" SelectedStyle="\APA.XSL" StyleName="APA"/>
+</file>
+
+<file path=customXml/item2.xml><?xml version="1.0" encoding="utf-8"?>
+<p:properties xmlns:p="http://schemas.microsoft.com/office/2006/metadata/properties" xmlns:xsi="http://www.w3.org/2001/XMLSchema-instance" xmlns:pc="http://schemas.microsoft.com/office/infopath/2007/PartnerControls">
+  <documentManagement>
+    <CostCentre xmlns="c369ec6e-e776-4cfb-9aab-85bbb2d3059b">XQD Quality and Development</CostCentre>
+    <Tag xmlns="c369ec6e-e776-4cfb-9aab-85bbb2d3059b" xsi:nil="true"/>
+    <Suffix xmlns="c369ec6e-e776-4cfb-9aab-85bbb2d3059b">12</Suffix>
+    <NameKeywords xmlns="c369ec6e-e776-4cfb-9aab-85bbb2d3059b">Assessment Task Tool instruction resource instrument</NameKeywords>
+    <Corpex xmlns="c369ec6e-e776-4cfb-9aab-85bbb2d3059b">false</Corpex>
+    <ByWhom xmlns="c369ec6e-e776-4cfb-9aab-85bbb2d3059b">Manager, VET Curriculum and Quality Assurance</ByWhom>
+    <Prefix xmlns="c369ec6e-e776-4cfb-9aab-85bbb2d3059b">Form</Prefix>
+    <UploadDate xmlns="c369ec6e-e776-4cfb-9aab-85bbb2d3059b">2020-02-02T16:00:00+00:00</UploadDate>
+    <ActionRequired xmlns="c369ec6e-e776-4cfb-9aab-85bbb2d3059b">Review</ActionRequired>
+    <Links xmlns="c369ec6e-e776-4cfb-9aab-85bbb2d3059b" xsi:nil="true"/>
+    <IssueNum xmlns="c369ec6e-e776-4cfb-9aab-85bbb2d3059b" xsi:nil="true"/>
+    <Division xmlns="c369ec6e-e776-4cfb-9aab-85bbb2d3059b">Training Services</Division>
+    <IssueDate xmlns="c369ec6e-e776-4cfb-9aab-85bbb2d3059b">2020-02-02T16:00:00+00:00</IssueDate>
+    <Pathway xmlns="7f1ed7a5-13c4-4640-91cb-37295ecf9af4">Academic</Pathway>
+    <CentralStatus xmlns="c369ec6e-e776-4cfb-9aab-85bbb2d3059b" xsi:nil="true"/>
+    <ProposedTitle xmlns="c369ec6e-e776-4cfb-9aab-85bbb2d3059b">Assessment Task Tool (F122A12)</ProposedTitle>
+    <Frequently xmlns="c369ec6e-e776-4cfb-9aab-85bbb2d3059b">false</Frequently>
+    <OtherReferences xmlns="c369ec6e-e776-4cfb-9aab-85bbb2d3059b" xsi:nil="true"/>
+    <CergDate xmlns="c369ec6e-e776-4cfb-9aab-85bbb2d3059b" xsi:nil="true"/>
+    <International xmlns="c369ec6e-e776-4cfb-9aab-85bbb2d3059b" xsi:nil="true"/>
+    <Portal xmlns="c369ec6e-e776-4cfb-9aab-85bbb2d3059b">false</Portal>
+    <PolicyNum xmlns="c369ec6e-e776-4cfb-9aab-85bbb2d3059b">122</PolicyNum>
+    <CorpexDate xmlns="c369ec6e-e776-4cfb-9aab-85bbb2d3059b" xsi:nil="true"/>
+    <ReviewDate xmlns="c369ec6e-e776-4cfb-9aab-85bbb2d3059b">03/02/2021</ReviewDate>
+    <Comments xmlns="http://schemas.microsoft.com/sharepoint/v3">03/02/2020 received from Fiona Ion to upload see HPE</Comments>
+    <Cerg xmlns="c369ec6e-e776-4cfb-9aab-85bbb2d3059b" xsi:nil="true"/>
+  </documentManagement>
+</p:properties>
+</file>
+
+<file path=customXml/item3.xml><?xml version="1.0" encoding="utf-8"?>
 <ct:contentTypeSchema xmlns:ct="http://schemas.microsoft.com/office/2006/metadata/contentType" xmlns:ma="http://schemas.microsoft.com/office/2006/metadata/properties/metaAttributes" ct:_="" ma:_="" ma:contentTypeName="Central Form" ma:contentTypeID="0x010100AF4BA1430F2E4F53972F8E467AD5D5BB00F4FFD117931942ADB9A5D6774F1709C200CCDBFE8310C71941B6FD8EACFAC6F789" ma:contentTypeVersion="3" ma:contentTypeDescription="Central Form Document" ma:contentTypeScope="" ma:versionID="6a0f9cc5cb7c4653d829a9673163df79">
   <xsd:schema xmlns:xsd="http://www.w3.org/2001/XMLSchema" xmlns:xs="http://www.w3.org/2001/XMLSchema" xmlns:p="http://schemas.microsoft.com/office/2006/metadata/properties" xmlns:ns1="http://schemas.microsoft.com/sharepoint/v3" xmlns:ns2="c369ec6e-e776-4cfb-9aab-85bbb2d3059b" xmlns:ns3="7f1ed7a5-13c4-4640-91cb-37295ecf9af4" targetNamespace="http://schemas.microsoft.com/office/2006/metadata/properties" ma:root="true" ma:fieldsID="3178bf5ea224a66b73ab1c50cae6997f" ns1:_="" ns2:_="" ns3:_="">
     <xsd:import namespace="http://schemas.microsoft.com/sharepoint/v3"/>
@@ -15666,44 +17910,11 @@
 </ct:contentTypeSchema>
 </file>
 
-<file path=customXml/item2.xml><?xml version="1.0" encoding="utf-8"?>
-<p:properties xmlns:p="http://schemas.microsoft.com/office/2006/metadata/properties" xmlns:xsi="http://www.w3.org/2001/XMLSchema-instance" xmlns:pc="http://schemas.microsoft.com/office/infopath/2007/PartnerControls">
-  <documentManagement>
-    <CostCentre xmlns="c369ec6e-e776-4cfb-9aab-85bbb2d3059b">XQD Quality and Development</CostCentre>
-    <Tag xmlns="c369ec6e-e776-4cfb-9aab-85bbb2d3059b" xsi:nil="true"/>
-    <Suffix xmlns="c369ec6e-e776-4cfb-9aab-85bbb2d3059b">12</Suffix>
-    <NameKeywords xmlns="c369ec6e-e776-4cfb-9aab-85bbb2d3059b">Assessment Task Tool instruction resource instrument</NameKeywords>
-    <Corpex xmlns="c369ec6e-e776-4cfb-9aab-85bbb2d3059b">false</Corpex>
-    <ByWhom xmlns="c369ec6e-e776-4cfb-9aab-85bbb2d3059b">Manager, VET Curriculum and Quality Assurance</ByWhom>
-    <Prefix xmlns="c369ec6e-e776-4cfb-9aab-85bbb2d3059b">Form</Prefix>
-    <UploadDate xmlns="c369ec6e-e776-4cfb-9aab-85bbb2d3059b">2020-02-02T16:00:00+00:00</UploadDate>
-    <ActionRequired xmlns="c369ec6e-e776-4cfb-9aab-85bbb2d3059b">Review</ActionRequired>
-    <Links xmlns="c369ec6e-e776-4cfb-9aab-85bbb2d3059b" xsi:nil="true"/>
-    <IssueNum xmlns="c369ec6e-e776-4cfb-9aab-85bbb2d3059b" xsi:nil="true"/>
-    <Division xmlns="c369ec6e-e776-4cfb-9aab-85bbb2d3059b">Training Services</Division>
-    <IssueDate xmlns="c369ec6e-e776-4cfb-9aab-85bbb2d3059b">2020-02-02T16:00:00+00:00</IssueDate>
-    <Pathway xmlns="7f1ed7a5-13c4-4640-91cb-37295ecf9af4">Academic</Pathway>
-    <CentralStatus xmlns="c369ec6e-e776-4cfb-9aab-85bbb2d3059b" xsi:nil="true"/>
-    <ProposedTitle xmlns="c369ec6e-e776-4cfb-9aab-85bbb2d3059b">Assessment Task Tool (F122A12)</ProposedTitle>
-    <Frequently xmlns="c369ec6e-e776-4cfb-9aab-85bbb2d3059b">false</Frequently>
-    <OtherReferences xmlns="c369ec6e-e776-4cfb-9aab-85bbb2d3059b" xsi:nil="true"/>
-    <CergDate xmlns="c369ec6e-e776-4cfb-9aab-85bbb2d3059b" xsi:nil="true"/>
-    <International xmlns="c369ec6e-e776-4cfb-9aab-85bbb2d3059b" xsi:nil="true"/>
-    <Portal xmlns="c369ec6e-e776-4cfb-9aab-85bbb2d3059b">false</Portal>
-    <PolicyNum xmlns="c369ec6e-e776-4cfb-9aab-85bbb2d3059b">122</PolicyNum>
-    <CorpexDate xmlns="c369ec6e-e776-4cfb-9aab-85bbb2d3059b" xsi:nil="true"/>
-    <ReviewDate xmlns="c369ec6e-e776-4cfb-9aab-85bbb2d3059b">03/02/2021</ReviewDate>
-    <Comments xmlns="http://schemas.microsoft.com/sharepoint/v3">03/02/2020 received from Fiona Ion to upload see HPE</Comments>
-    <Cerg xmlns="c369ec6e-e776-4cfb-9aab-85bbb2d3059b" xsi:nil="true"/>
-  </documentManagement>
-</p:properties>
+<file path=customXml/item4.xml><?xml version="1.0" encoding="utf-8"?>
+<LongProperties xmlns="http://schemas.microsoft.com/office/2006/metadata/longProperties"/>
 </file>
 
-<file path=customXml/item3.xml><?xml version="1.0" encoding="utf-8"?>
-<b:Sources xmlns:b="http://schemas.openxmlformats.org/officeDocument/2006/bibliography" xmlns="http://schemas.openxmlformats.org/officeDocument/2006/bibliography" SelectedStyle="\APA.XSL" StyleName="APA"/>
-</file>
-
-<file path=customXml/item4.xml><?xml version="1.0" encoding="utf-8"?>
+<file path=customXml/item5.xml><?xml version="1.0" encoding="utf-8"?>
 <?mso-contentType ?>
 <FormTemplates xmlns="http://schemas.microsoft.com/sharepoint/v3/contenttype/forms">
   <Display>DocumentLibraryForm</Display>
@@ -15712,11 +17923,27 @@
 </FormTemplates>
 </file>
 
-<file path=customXml/item5.xml><?xml version="1.0" encoding="utf-8"?>
-<LongProperties xmlns="http://schemas.microsoft.com/office/2006/metadata/longProperties"/>
+<file path=customXml/itemProps1.xml><?xml version="1.0" encoding="utf-8"?>
+<ds:datastoreItem xmlns:ds="http://schemas.openxmlformats.org/officeDocument/2006/customXml" ds:itemID="{270A1387-5032-421F-ABE8-3776CE5E5F42}">
+  <ds:schemaRefs>
+    <ds:schemaRef ds:uri="http://schemas.openxmlformats.org/officeDocument/2006/bibliography"/>
+  </ds:schemaRefs>
+</ds:datastoreItem>
 </file>
 
-<file path=customXml/itemProps1.xml><?xml version="1.0" encoding="utf-8"?>
+<file path=customXml/itemProps2.xml><?xml version="1.0" encoding="utf-8"?>
+<ds:datastoreItem xmlns:ds="http://schemas.openxmlformats.org/officeDocument/2006/customXml" ds:itemID="{A16F99D5-FAF9-47B7-BB2E-CAC1EF9F3B71}">
+  <ds:schemaRefs>
+    <ds:schemaRef ds:uri="http://schemas.microsoft.com/office/2006/metadata/properties"/>
+    <ds:schemaRef ds:uri="http://schemas.microsoft.com/office/infopath/2007/PartnerControls"/>
+    <ds:schemaRef ds:uri="c369ec6e-e776-4cfb-9aab-85bbb2d3059b"/>
+    <ds:schemaRef ds:uri="7f1ed7a5-13c4-4640-91cb-37295ecf9af4"/>
+    <ds:schemaRef ds:uri="http://schemas.microsoft.com/sharepoint/v3"/>
+  </ds:schemaRefs>
+</ds:datastoreItem>
+</file>
+
+<file path=customXml/itemProps3.xml><?xml version="1.0" encoding="utf-8"?>
 <ds:datastoreItem xmlns:ds="http://schemas.openxmlformats.org/officeDocument/2006/customXml" ds:itemID="{4EF5FC08-38BC-4F0F-9CE8-A9969E73295E}">
   <ds:schemaRefs>
     <ds:schemaRef ds:uri="http://schemas.microsoft.com/office/2006/metadata/contentType"/>
@@ -15736,38 +17963,18 @@
 </ds:datastoreItem>
 </file>
 
-<file path=customXml/itemProps2.xml><?xml version="1.0" encoding="utf-8"?>
-<ds:datastoreItem xmlns:ds="http://schemas.openxmlformats.org/officeDocument/2006/customXml" ds:itemID="{A16F99D5-FAF9-47B7-BB2E-CAC1EF9F3B71}">
+<file path=customXml/itemProps4.xml><?xml version="1.0" encoding="utf-8"?>
+<ds:datastoreItem xmlns:ds="http://schemas.openxmlformats.org/officeDocument/2006/customXml" ds:itemID="{ED9C3AC7-65F6-444B-AAD9-BED76FF91658}">
   <ds:schemaRefs>
-    <ds:schemaRef ds:uri="http://schemas.microsoft.com/office/2006/metadata/properties"/>
-    <ds:schemaRef ds:uri="http://schemas.microsoft.com/office/infopath/2007/PartnerControls"/>
-    <ds:schemaRef ds:uri="c369ec6e-e776-4cfb-9aab-85bbb2d3059b"/>
-    <ds:schemaRef ds:uri="7f1ed7a5-13c4-4640-91cb-37295ecf9af4"/>
-    <ds:schemaRef ds:uri="http://schemas.microsoft.com/sharepoint/v3"/>
+    <ds:schemaRef ds:uri="http://schemas.microsoft.com/office/2006/metadata/longProperties"/>
   </ds:schemaRefs>
 </ds:datastoreItem>
 </file>
 
-<file path=customXml/itemProps3.xml><?xml version="1.0" encoding="utf-8"?>
-<ds:datastoreItem xmlns:ds="http://schemas.openxmlformats.org/officeDocument/2006/customXml" ds:itemID="{270A1387-5032-421F-ABE8-3776CE5E5F42}">
-  <ds:schemaRefs>
-    <ds:schemaRef ds:uri="http://schemas.openxmlformats.org/officeDocument/2006/bibliography"/>
-  </ds:schemaRefs>
-</ds:datastoreItem>
-</file>
-
-<file path=customXml/itemProps4.xml><?xml version="1.0" encoding="utf-8"?>
+<file path=customXml/itemProps5.xml><?xml version="1.0" encoding="utf-8"?>
 <ds:datastoreItem xmlns:ds="http://schemas.openxmlformats.org/officeDocument/2006/customXml" ds:itemID="{96001339-1F25-4BDD-94F9-AA3400008571}">
   <ds:schemaRefs>
     <ds:schemaRef ds:uri="http://schemas.microsoft.com/sharepoint/v3/contenttype/forms"/>
   </ds:schemaRefs>
 </ds:datastoreItem>
-</file>
-
-<file path=customXml/itemProps5.xml><?xml version="1.0" encoding="utf-8"?>
-<ds:datastoreItem xmlns:ds="http://schemas.openxmlformats.org/officeDocument/2006/customXml" ds:itemID="{ED9C3AC7-65F6-444B-AAD9-BED76FF91658}">
-  <ds:schemaRefs>
-    <ds:schemaRef ds:uri="http://schemas.microsoft.com/office/2006/metadata/longProperties"/>
-  </ds:schemaRefs>
-</ds:datastoreItem>
 </file>
</xml_diff>